<commit_message>
docs: agregar contexto (MD), informes y plan de pruebas de caja negra
Sube a docs/ los archivos de contexto para retomar el proyecto en otros
entornos (CONTEXTO_SRV_CORTO.md, CONTEXTO_SRV_PARA_IA.md), el informe
tecnico TDDR lleno (con resultados de determinismo), el plan de pruebas
de caja negra y demas documentacion. Se excluye 'Plan de pruebas.pdf'
(datos personales de terceros) y archivos scratch.

Co-Authored-By: Claude Opus 4.8 <noreply@anthropic.com>
</commit_message>
<xml_diff>
--- a/docs/INFORME_CAPSTONE_SRV.docx
+++ b/docs/INFORME_CAPSTONE_SRV.docx
@@ -1,6 +1,6 @@
 
 <file path=word/document.xml><?xml version="1.0" encoding="utf-8"?>
-<w:document xmlns:wpc="http://schemas.microsoft.com/office/word/2010/wordprocessingCanvas" xmlns:cx="http://schemas.microsoft.com/office/drawing/2014/chartex" xmlns:cx1="http://schemas.microsoft.com/office/drawing/2015/9/8/chartex" xmlns:cx2="http://schemas.microsoft.com/office/drawing/2015/10/21/chartex" xmlns:cx3="http://schemas.microsoft.com/office/drawing/2016/5/9/chartex" xmlns:cx4="http://schemas.microsoft.com/office/drawing/2016/5/10/chartex" xmlns:cx5="http://schemas.microsoft.com/office/drawing/2016/5/11/chartex" xmlns:cx6="http://schemas.microsoft.com/office/drawing/2016/5/12/chartex" xmlns:cx7="http://schemas.microsoft.com/office/drawing/2016/5/13/chartex" xmlns:cx8="http://schemas.microsoft.com/office/drawing/2016/5/14/chartex" xmlns:mc="http://schemas.openxmlformats.org/markup-compatibility/2006" xmlns:aink="http://schemas.microsoft.com/office/drawing/2016/ink" xmlns:am3d="http://schemas.microsoft.com/office/drawing/2017/model3d" xmlns:o="urn:schemas-microsoft-com:office:office" xmlns:r="http://schemas.openxmlformats.org/officeDocument/2006/relationships" xmlns:m="http://schemas.openxmlformats.org/officeDocument/2006/math" xmlns:v="urn:schemas-microsoft-com:vml" xmlns:wp14="http://schemas.microsoft.com/office/word/2010/wordprocessingDrawing" xmlns:wp="http://schemas.openxmlformats.org/drawingml/2006/wordprocessingDrawing" xmlns:w10="urn:schemas-microsoft-com:office:word" xmlns:w="http://schemas.openxmlformats.org/wordprocessingml/2006/main" xmlns:w14="http://schemas.microsoft.com/office/word/2010/wordml" xmlns:w15="http://schemas.microsoft.com/office/word/2012/wordml" xmlns:w16cex="http://schemas.microsoft.com/office/word/2018/wordml/cex" xmlns:w16cid="http://schemas.microsoft.com/office/word/2016/wordml/cid" xmlns:w16="http://schemas.microsoft.com/office/word/2018/wordml" xmlns:w16sdtdh="http://schemas.microsoft.com/office/word/2020/wordml/sdtdatahash" xmlns:w16se="http://schemas.microsoft.com/office/word/2015/wordml/symex" xmlns:wpg="http://schemas.microsoft.com/office/word/2010/wordprocessingGroup" xmlns:wpi="http://schemas.microsoft.com/office/word/2010/wordprocessingInk" xmlns:wne="http://schemas.microsoft.com/office/word/2006/wordml" xmlns:wps="http://schemas.microsoft.com/office/word/2010/wordprocessingShape" mc:Ignorable="w14 w15 w16se w16cid w16 w16cex w16sdtdh wp14">
+<w:document xmlns:wpc="http://schemas.microsoft.com/office/word/2010/wordprocessingCanvas" xmlns:cx="http://schemas.microsoft.com/office/drawing/2014/chartex" xmlns:cx1="http://schemas.microsoft.com/office/drawing/2015/9/8/chartex" xmlns:cx2="http://schemas.microsoft.com/office/drawing/2015/10/21/chartex" xmlns:cx3="http://schemas.microsoft.com/office/drawing/2016/5/9/chartex" xmlns:cx4="http://schemas.microsoft.com/office/drawing/2016/5/10/chartex" xmlns:cx5="http://schemas.microsoft.com/office/drawing/2016/5/11/chartex" xmlns:cx6="http://schemas.microsoft.com/office/drawing/2016/5/12/chartex" xmlns:cx7="http://schemas.microsoft.com/office/drawing/2016/5/13/chartex" xmlns:cx8="http://schemas.microsoft.com/office/drawing/2016/5/14/chartex" xmlns:mc="http://schemas.openxmlformats.org/markup-compatibility/2006" xmlns:aink="http://schemas.microsoft.com/office/drawing/2016/ink" xmlns:am3d="http://schemas.microsoft.com/office/drawing/2017/model3d" xmlns:o="urn:schemas-microsoft-com:office:office" xmlns:oel="http://schemas.microsoft.com/office/2019/extlst" xmlns:r="http://schemas.openxmlformats.org/officeDocument/2006/relationships" xmlns:m="http://schemas.openxmlformats.org/officeDocument/2006/math" xmlns:v="urn:schemas-microsoft-com:vml" xmlns:wp14="http://schemas.microsoft.com/office/word/2010/wordprocessingDrawing" xmlns:wp="http://schemas.openxmlformats.org/drawingml/2006/wordprocessingDrawing" xmlns:w10="urn:schemas-microsoft-com:office:word" xmlns:w="http://schemas.openxmlformats.org/wordprocessingml/2006/main" xmlns:w14="http://schemas.microsoft.com/office/word/2010/wordml" xmlns:w15="http://schemas.microsoft.com/office/word/2012/wordml" xmlns:w16cex="http://schemas.microsoft.com/office/word/2018/wordml/cex" xmlns:w16cid="http://schemas.microsoft.com/office/word/2016/wordml/cid" xmlns:w16="http://schemas.microsoft.com/office/word/2018/wordml" xmlns:w16du="http://schemas.microsoft.com/office/word/2023/wordml/word16du" xmlns:w16sdtdh="http://schemas.microsoft.com/office/word/2020/wordml/sdtdatahash" xmlns:w16sdtfl="http://schemas.microsoft.com/office/word/2024/wordml/sdtformatlock" xmlns:w16se="http://schemas.microsoft.com/office/word/2015/wordml/symex" xmlns:wpg="http://schemas.microsoft.com/office/word/2010/wordprocessingGroup" xmlns:wpi="http://schemas.microsoft.com/office/word/2010/wordprocessingInk" xmlns:wne="http://schemas.microsoft.com/office/word/2006/wordml" xmlns:wps="http://schemas.microsoft.com/office/word/2010/wordprocessingShape" mc:Ignorable="w14 w15 w16se w16cid w16 w16cex w16sdtdh w16sdtfl w16du wp14">
   <w:body>
     <w:p>
       <w:pPr>
@@ -39,22 +39,19 @@
         <w:pStyle w:val="Ttulo"/>
       </w:pPr>
       <w:r>
-        <w:t>PROGRAMA DE ESTUDIO DE INGENIERÍA DE SISTEMAS E INTELIGENCIA ARTIFICIAL</w:t>
-      </w:r>
-      <w:r>
         <w:rPr>
           <w:noProof/>
         </w:rPr>
         <w:drawing>
-          <wp:anchor distT="0" distB="0" distL="114300" distR="114300" simplePos="0" relativeHeight="251658240" behindDoc="0" locked="0" layoutInCell="1" hidden="0" allowOverlap="1" wp14:anchorId="6344FD3C" wp14:editId="68B3C056">
+          <wp:anchor distT="0" distB="0" distL="114300" distR="114300" simplePos="0" relativeHeight="251658240" behindDoc="0" locked="0" layoutInCell="1" hidden="0" allowOverlap="1" wp14:anchorId="6344FD3C" wp14:editId="1CB1D8D9">
             <wp:simplePos x="0" y="0"/>
             <wp:positionH relativeFrom="column">
-              <wp:posOffset>1345882</wp:posOffset>
+              <wp:posOffset>2090535</wp:posOffset>
             </wp:positionH>
             <wp:positionV relativeFrom="paragraph">
-              <wp:posOffset>760268</wp:posOffset>
+              <wp:posOffset>739519</wp:posOffset>
             </wp:positionV>
-            <wp:extent cx="2708275" cy="2708275"/>
+            <wp:extent cx="1175385" cy="1282065"/>
             <wp:effectExtent l="0" t="0" r="0" b="0"/>
             <wp:wrapTopAndBottom distT="0" distB="0"/>
             <wp:docPr id="6" name="image1.png" descr="Imagen relacionada"/>
@@ -76,7 +73,7 @@
                   <pic:spPr>
                     <a:xfrm>
                       <a:off x="0" y="0"/>
-                      <a:ext cx="2708275" cy="2708275"/>
+                      <a:ext cx="1175385" cy="1282065"/>
                     </a:xfrm>
                     <a:prstGeom prst="rect">
                       <a:avLst/>
@@ -86,8 +83,17 @@
                 </pic:pic>
               </a:graphicData>
             </a:graphic>
+            <wp14:sizeRelH relativeFrom="margin">
+              <wp14:pctWidth>0</wp14:pctWidth>
+            </wp14:sizeRelH>
+            <wp14:sizeRelV relativeFrom="margin">
+              <wp14:pctHeight>0</wp14:pctHeight>
+            </wp14:sizeRelV>
           </wp:anchor>
         </w:drawing>
+      </w:r>
+      <w:r>
+        <w:t>PROGRAMA DE ESTUDIO DE INGENIERÍA DE SISTEMAS E INTELIGENCIA ARTIFICIAL</w:t>
       </w:r>
     </w:p>
     <w:p/>
@@ -122,7 +128,7 @@
           <w:sz w:val="32"/>
           <w:szCs w:val="32"/>
         </w:rPr>
-        <w:t>Sistema de Retroalimentación por Voz (SRV) basado en Inteligencia Artificial para la mejora de la fluidez de oratoria en estudiantes de primer grado de primaria de la I.E. Juan José Farfán, Lancones - Piura</w:t>
+        <w:t>Sistema de Retroalimentación por Voz (SRV) basado en Inteligencia Artificial para la evaluación y retroalimentación de la fluidez de oratoria en educación primaria</w:t>
       </w:r>
     </w:p>
     <w:p>
@@ -152,7 +158,6 @@
           <w:tag w:val="goog_rdk_0"/>
           <w:id w:val="-1901971904"/>
         </w:sdtPr>
-        <w:sdtEndPr/>
         <w:sdtContent/>
       </w:sdt>
       <w:sdt>
@@ -160,7 +165,6 @@
           <w:tag w:val="goog_rdk_1"/>
           <w:id w:val="2084866720"/>
         </w:sdtPr>
-        <w:sdtEndPr/>
         <w:sdtContent/>
       </w:sdt>
       <w:r>
@@ -338,21 +342,6 @@
           <w:b/>
           <w:i w:val="0"/>
           <w:color w:val="000000"/>
-          <w:sz w:val="32"/>
-          <w:szCs w:val="32"/>
-        </w:rPr>
-      </w:pPr>
-    </w:p>
-    <w:p>
-      <w:pPr>
-        <w:pStyle w:val="Ttulo4"/>
-        <w:spacing w:before="160" w:line="276" w:lineRule="auto"/>
-        <w:jc w:val="center"/>
-        <w:rPr>
-          <w:rFonts w:ascii="Times New Roman" w:eastAsia="Times New Roman" w:hAnsi="Times New Roman" w:cs="Times New Roman"/>
-          <w:b/>
-          <w:i w:val="0"/>
-          <w:color w:val="000000"/>
           <w:sz w:val="24"/>
           <w:szCs w:val="24"/>
         </w:rPr>
@@ -362,7 +351,6 @@
           <w:tag w:val="goog_rdk_2"/>
           <w:id w:val="1030763796"/>
         </w:sdtPr>
-        <w:sdtEndPr/>
         <w:sdtContent/>
       </w:sdt>
       <w:r>
@@ -379,10 +367,10 @@
     </w:p>
     <w:p>
       <w:pPr>
-        <w:spacing w:after="0" w:line="360" w:lineRule="auto"/>
+        <w:spacing w:after="0"/>
         <w:jc w:val="center"/>
         <w:rPr>
-          <w:rFonts w:ascii="Arial" w:eastAsia="Arial" w:hAnsi="Arial" w:cs="Arial"/>
+          <w:rFonts w:eastAsia="Arial" w:cs="Arial"/>
           <w:b/>
           <w:sz w:val="24"/>
           <w:szCs w:val="24"/>
@@ -391,9 +379,9 @@
     </w:p>
     <w:p>
       <w:pPr>
-        <w:spacing w:after="0" w:line="360" w:lineRule="auto"/>
+        <w:spacing w:after="0"/>
         <w:rPr>
-          <w:rFonts w:ascii="Arial" w:eastAsia="Arial" w:hAnsi="Arial" w:cs="Arial"/>
+          <w:rFonts w:eastAsia="Arial" w:cs="Arial"/>
           <w:b/>
           <w:sz w:val="24"/>
           <w:szCs w:val="24"/>
@@ -402,11 +390,11 @@
     </w:p>
     <w:p>
       <w:pPr>
-        <w:spacing w:after="0" w:line="360" w:lineRule="auto"/>
+        <w:spacing w:after="0"/>
         <w:ind w:left="720"/>
         <w:jc w:val="both"/>
         <w:rPr>
-          <w:rFonts w:ascii="Arial" w:eastAsia="Arial" w:hAnsi="Arial" w:cs="Arial"/>
+          <w:rFonts w:eastAsia="Arial" w:cs="Arial"/>
           <w:sz w:val="24"/>
           <w:szCs w:val="24"/>
         </w:rPr>
@@ -415,7 +403,7 @@
     <w:p>
       <w:pPr>
         <w:rPr>
-          <w:rFonts w:ascii="Arial" w:eastAsia="Arial" w:hAnsi="Arial" w:cs="Arial"/>
+          <w:rFonts w:eastAsia="Arial" w:cs="Arial"/>
           <w:b/>
           <w:sz w:val="24"/>
           <w:szCs w:val="24"/>
@@ -431,7 +419,6 @@
         <w:id w:val="1691883181"/>
         <w:lock w:val="contentLocked"/>
       </w:sdtPr>
-      <w:sdtEndPr/>
       <w:sdtContent>
         <w:tbl>
           <w:tblPr>
@@ -458,7 +445,6 @@
             <w:tc>
               <w:tcPr>
                 <w:tcW w:w="2565" w:type="dxa"/>
-                <w:shd w:val="clear" w:color="auto" w:fill="auto"/>
                 <w:tcMar>
                   <w:top w:w="100" w:type="dxa"/>
                   <w:left w:w="100" w:type="dxa"/>
@@ -478,14 +464,14 @@
                   </w:pBdr>
                   <w:spacing w:after="0" w:line="240" w:lineRule="auto"/>
                   <w:rPr>
-                    <w:rFonts w:ascii="Arial" w:eastAsia="Arial" w:hAnsi="Arial" w:cs="Arial"/>
+                    <w:rFonts w:eastAsia="Arial" w:cs="Arial"/>
                     <w:color w:val="FF0000"/>
                     <w:highlight w:val="yellow"/>
                   </w:rPr>
                 </w:pPr>
                 <w:r>
                   <w:rPr>
-                    <w:rFonts w:ascii="Arial" w:eastAsia="Arial" w:hAnsi="Arial" w:cs="Arial"/>
+                    <w:rFonts w:eastAsia="Arial" w:cs="Arial"/>
                     <w:color w:val="FF0000"/>
                     <w:highlight w:val="yellow"/>
                   </w:rPr>
@@ -496,7 +482,6 @@
             <w:tc>
               <w:tcPr>
                 <w:tcW w:w="3450" w:type="dxa"/>
-                <w:shd w:val="clear" w:color="auto" w:fill="auto"/>
                 <w:tcMar>
                   <w:top w:w="100" w:type="dxa"/>
                   <w:left w:w="100" w:type="dxa"/>
@@ -516,14 +501,14 @@
                   </w:pBdr>
                   <w:spacing w:after="0" w:line="240" w:lineRule="auto"/>
                   <w:rPr>
-                    <w:rFonts w:ascii="Arial" w:eastAsia="Arial" w:hAnsi="Arial" w:cs="Arial"/>
+                    <w:rFonts w:eastAsia="Arial" w:cs="Arial"/>
                     <w:color w:val="FF0000"/>
                     <w:highlight w:val="yellow"/>
                   </w:rPr>
                 </w:pPr>
                 <w:r>
                   <w:rPr>
-                    <w:rFonts w:ascii="Arial" w:eastAsia="Arial" w:hAnsi="Arial" w:cs="Arial"/>
+                    <w:rFonts w:eastAsia="Arial" w:cs="Arial"/>
                     <w:color w:val="FF0000"/>
                     <w:highlight w:val="yellow"/>
                   </w:rPr>
@@ -534,7 +519,6 @@
             <w:tc>
               <w:tcPr>
                 <w:tcW w:w="2355" w:type="dxa"/>
-                <w:shd w:val="clear" w:color="auto" w:fill="auto"/>
                 <w:tcMar>
                   <w:top w:w="100" w:type="dxa"/>
                   <w:left w:w="100" w:type="dxa"/>
@@ -554,14 +538,14 @@
                   </w:pBdr>
                   <w:spacing w:after="0" w:line="240" w:lineRule="auto"/>
                   <w:rPr>
-                    <w:rFonts w:ascii="Arial" w:eastAsia="Arial" w:hAnsi="Arial" w:cs="Arial"/>
+                    <w:rFonts w:eastAsia="Arial" w:cs="Arial"/>
                     <w:color w:val="FF0000"/>
                     <w:highlight w:val="yellow"/>
                   </w:rPr>
                 </w:pPr>
                 <w:r>
                   <w:rPr>
-                    <w:rFonts w:ascii="Arial" w:eastAsia="Arial" w:hAnsi="Arial" w:cs="Arial"/>
+                    <w:rFonts w:eastAsia="Arial" w:cs="Arial"/>
                     <w:color w:val="FF0000"/>
                     <w:highlight w:val="yellow"/>
                   </w:rPr>
@@ -574,7 +558,6 @@
             <w:tc>
               <w:tcPr>
                 <w:tcW w:w="2565" w:type="dxa"/>
-                <w:shd w:val="clear" w:color="auto" w:fill="auto"/>
                 <w:tcMar>
                   <w:top w:w="100" w:type="dxa"/>
                   <w:left w:w="100" w:type="dxa"/>
@@ -594,14 +577,14 @@
                   </w:pBdr>
                   <w:spacing w:after="0" w:line="240" w:lineRule="auto"/>
                   <w:rPr>
-                    <w:rFonts w:ascii="Arial" w:eastAsia="Arial" w:hAnsi="Arial" w:cs="Arial"/>
+                    <w:rFonts w:eastAsia="Arial" w:cs="Arial"/>
                     <w:color w:val="FF0000"/>
                     <w:highlight w:val="yellow"/>
                   </w:rPr>
                 </w:pPr>
                 <w:r>
                   <w:rPr>
-                    <w:rFonts w:ascii="Arial" w:eastAsia="Arial" w:hAnsi="Arial" w:cs="Arial"/>
+                    <w:rFonts w:eastAsia="Arial" w:cs="Arial"/>
                     <w:color w:val="FF0000"/>
                     <w:highlight w:val="yellow"/>
                   </w:rPr>
@@ -612,7 +595,6 @@
             <w:tc>
               <w:tcPr>
                 <w:tcW w:w="3450" w:type="dxa"/>
-                <w:shd w:val="clear" w:color="auto" w:fill="auto"/>
                 <w:tcMar>
                   <w:top w:w="100" w:type="dxa"/>
                   <w:left w:w="100" w:type="dxa"/>
@@ -632,14 +614,14 @@
                   </w:pBdr>
                   <w:spacing w:after="0" w:line="240" w:lineRule="auto"/>
                   <w:rPr>
-                    <w:rFonts w:ascii="Arial" w:eastAsia="Arial" w:hAnsi="Arial" w:cs="Arial"/>
+                    <w:rFonts w:eastAsia="Arial" w:cs="Arial"/>
                     <w:color w:val="FF0000"/>
                     <w:highlight w:val="yellow"/>
                   </w:rPr>
                 </w:pPr>
                 <w:r>
                   <w:rPr>
-                    <w:rFonts w:ascii="Arial" w:eastAsia="Arial" w:hAnsi="Arial" w:cs="Arial"/>
+                    <w:rFonts w:eastAsia="Arial" w:cs="Arial"/>
                     <w:color w:val="FF0000"/>
                     <w:highlight w:val="yellow"/>
                   </w:rPr>
@@ -650,7 +632,6 @@
             <w:tc>
               <w:tcPr>
                 <w:tcW w:w="2355" w:type="dxa"/>
-                <w:shd w:val="clear" w:color="auto" w:fill="auto"/>
                 <w:tcMar>
                   <w:top w:w="100" w:type="dxa"/>
                   <w:left w:w="100" w:type="dxa"/>
@@ -670,14 +651,14 @@
                   </w:pBdr>
                   <w:spacing w:after="0" w:line="240" w:lineRule="auto"/>
                   <w:rPr>
-                    <w:rFonts w:ascii="Arial" w:eastAsia="Arial" w:hAnsi="Arial" w:cs="Arial"/>
+                    <w:rFonts w:eastAsia="Arial" w:cs="Arial"/>
                     <w:color w:val="FF0000"/>
                     <w:highlight w:val="yellow"/>
                   </w:rPr>
                 </w:pPr>
                 <w:r>
                   <w:rPr>
-                    <w:rFonts w:ascii="Arial" w:eastAsia="Arial" w:hAnsi="Arial" w:cs="Arial"/>
+                    <w:rFonts w:eastAsia="Arial" w:cs="Arial"/>
                     <w:color w:val="FF0000"/>
                     <w:highlight w:val="yellow"/>
                   </w:rPr>
@@ -693,7 +674,6 @@
             <w:tc>
               <w:tcPr>
                 <w:tcW w:w="2565" w:type="dxa"/>
-                <w:shd w:val="clear" w:color="auto" w:fill="auto"/>
                 <w:tcMar>
                   <w:top w:w="100" w:type="dxa"/>
                   <w:left w:w="100" w:type="dxa"/>
@@ -706,7 +686,7 @@
                   <w:widowControl w:val="0"/>
                   <w:spacing w:after="0" w:line="240" w:lineRule="auto"/>
                   <w:rPr>
-                    <w:rFonts w:ascii="Arial" w:eastAsia="Arial" w:hAnsi="Arial" w:cs="Arial"/>
+                    <w:rFonts w:eastAsia="Arial" w:cs="Arial"/>
                     <w:color w:val="FF0000"/>
                     <w:highlight w:val="yellow"/>
                   </w:rPr>
@@ -755,14 +735,14 @@
                         <w:widowControl w:val="0"/>
                         <w:spacing w:after="0" w:line="240" w:lineRule="auto"/>
                         <w:rPr>
-                          <w:rFonts w:ascii="Arial" w:eastAsia="Arial" w:hAnsi="Arial" w:cs="Arial"/>
+                          <w:rFonts w:eastAsia="Arial" w:cs="Arial"/>
                           <w:color w:val="FF0000"/>
                           <w:highlight w:val="yellow"/>
                         </w:rPr>
                       </w:pPr>
                       <w:r>
                         <w:rPr>
-                          <w:rFonts w:ascii="Arial" w:eastAsia="Arial" w:hAnsi="Arial" w:cs="Arial"/>
+                          <w:rFonts w:eastAsia="Arial" w:cs="Arial"/>
                           <w:color w:val="FF0000"/>
                           <w:highlight w:val="yellow"/>
                         </w:rPr>
@@ -784,7 +764,7 @@
                   </w:pBdr>
                   <w:spacing w:after="0" w:line="240" w:lineRule="auto"/>
                   <w:rPr>
-                    <w:rFonts w:ascii="Arial" w:eastAsia="Arial" w:hAnsi="Arial" w:cs="Arial"/>
+                    <w:rFonts w:eastAsia="Arial" w:cs="Arial"/>
                     <w:color w:val="FF0000"/>
                     <w:highlight w:val="yellow"/>
                   </w:rPr>
@@ -794,7 +774,6 @@
             <w:tc>
               <w:tcPr>
                 <w:tcW w:w="3450" w:type="dxa"/>
-                <w:shd w:val="clear" w:color="auto" w:fill="auto"/>
                 <w:tcMar>
                   <w:top w:w="100" w:type="dxa"/>
                   <w:left w:w="100" w:type="dxa"/>
@@ -807,7 +786,7 @@
                   <w:widowControl w:val="0"/>
                   <w:spacing w:after="0" w:line="240" w:lineRule="auto"/>
                   <w:rPr>
-                    <w:rFonts w:ascii="Arial" w:eastAsia="Arial" w:hAnsi="Arial" w:cs="Arial"/>
+                    <w:rFonts w:eastAsia="Arial" w:cs="Arial"/>
                     <w:color w:val="FF0000"/>
                     <w:highlight w:val="yellow"/>
                   </w:rPr>
@@ -857,21 +836,20 @@
                         <w:id w:val="1217167265"/>
                         <w:lock w:val="contentLocked"/>
                       </w:sdtPr>
-                      <w:sdtEndPr/>
                       <w:sdtContent>
                         <w:p>
                           <w:pPr>
                             <w:widowControl w:val="0"/>
                             <w:spacing w:after="0" w:line="240" w:lineRule="auto"/>
                             <w:rPr>
-                              <w:rFonts w:ascii="Arial" w:eastAsia="Arial" w:hAnsi="Arial" w:cs="Arial"/>
+                              <w:rFonts w:eastAsia="Arial" w:cs="Arial"/>
                               <w:color w:val="FF0000"/>
                               <w:highlight w:val="yellow"/>
                             </w:rPr>
                           </w:pPr>
                           <w:r>
                             <w:rPr>
-                              <w:rFonts w:ascii="Arial" w:eastAsia="Arial" w:hAnsi="Arial" w:cs="Arial"/>
+                              <w:rFonts w:eastAsia="Arial" w:cs="Arial"/>
                               <w:color w:val="FF0000"/>
                               <w:highlight w:val="yellow"/>
                             </w:rPr>
@@ -888,7 +866,7 @@
                   <w:widowControl w:val="0"/>
                   <w:spacing w:after="0" w:line="240" w:lineRule="auto"/>
                   <w:rPr>
-                    <w:rFonts w:ascii="Arial" w:eastAsia="Arial" w:hAnsi="Arial" w:cs="Arial"/>
+                    <w:rFonts w:eastAsia="Arial" w:cs="Arial"/>
                     <w:color w:val="FF0000"/>
                     <w:highlight w:val="yellow"/>
                   </w:rPr>
@@ -898,7 +876,6 @@
             <w:tc>
               <w:tcPr>
                 <w:tcW w:w="2355" w:type="dxa"/>
-                <w:shd w:val="clear" w:color="auto" w:fill="auto"/>
                 <w:tcMar>
                   <w:top w:w="100" w:type="dxa"/>
                   <w:left w:w="100" w:type="dxa"/>
@@ -911,14 +888,14 @@
                   <w:widowControl w:val="0"/>
                   <w:spacing w:after="0" w:line="240" w:lineRule="auto"/>
                   <w:rPr>
-                    <w:rFonts w:ascii="Arial" w:eastAsia="Arial" w:hAnsi="Arial" w:cs="Arial"/>
+                    <w:rFonts w:eastAsia="Arial" w:cs="Arial"/>
                     <w:color w:val="FF0000"/>
                     <w:highlight w:val="yellow"/>
                   </w:rPr>
                 </w:pPr>
                 <w:r>
                   <w:rPr>
-                    <w:rFonts w:ascii="Arial" w:eastAsia="Arial" w:hAnsi="Arial" w:cs="Arial"/>
+                    <w:rFonts w:eastAsia="Arial" w:cs="Arial"/>
                     <w:color w:val="FF0000"/>
                     <w:highlight w:val="yellow"/>
                   </w:rPr>
@@ -931,7 +908,6 @@
             <w:tc>
               <w:tcPr>
                 <w:tcW w:w="2565" w:type="dxa"/>
-                <w:shd w:val="clear" w:color="auto" w:fill="auto"/>
                 <w:tcMar>
                   <w:top w:w="100" w:type="dxa"/>
                   <w:left w:w="100" w:type="dxa"/>
@@ -951,14 +927,14 @@
                   </w:pBdr>
                   <w:spacing w:after="0" w:line="240" w:lineRule="auto"/>
                   <w:rPr>
-                    <w:rFonts w:ascii="Arial" w:eastAsia="Arial" w:hAnsi="Arial" w:cs="Arial"/>
+                    <w:rFonts w:eastAsia="Arial" w:cs="Arial"/>
                     <w:color w:val="FF0000"/>
                     <w:highlight w:val="yellow"/>
                   </w:rPr>
                 </w:pPr>
                 <w:r>
                   <w:rPr>
-                    <w:rFonts w:ascii="Arial" w:eastAsia="Arial" w:hAnsi="Arial" w:cs="Arial"/>
+                    <w:rFonts w:eastAsia="Arial" w:cs="Arial"/>
                     <w:color w:val="FF0000"/>
                     <w:highlight w:val="yellow"/>
                   </w:rPr>
@@ -969,7 +945,6 @@
             <w:tc>
               <w:tcPr>
                 <w:tcW w:w="3450" w:type="dxa"/>
-                <w:shd w:val="clear" w:color="auto" w:fill="auto"/>
                 <w:tcMar>
                   <w:top w:w="100" w:type="dxa"/>
                   <w:left w:w="100" w:type="dxa"/>
@@ -989,14 +964,14 @@
                   </w:pBdr>
                   <w:spacing w:after="0" w:line="240" w:lineRule="auto"/>
                   <w:rPr>
-                    <w:rFonts w:ascii="Arial" w:eastAsia="Arial" w:hAnsi="Arial" w:cs="Arial"/>
+                    <w:rFonts w:eastAsia="Arial" w:cs="Arial"/>
                     <w:color w:val="FF0000"/>
                     <w:highlight w:val="yellow"/>
                   </w:rPr>
                 </w:pPr>
                 <w:r>
                   <w:rPr>
-                    <w:rFonts w:ascii="Arial" w:eastAsia="Arial" w:hAnsi="Arial" w:cs="Arial"/>
+                    <w:rFonts w:eastAsia="Arial" w:cs="Arial"/>
                     <w:color w:val="FF0000"/>
                     <w:highlight w:val="yellow"/>
                   </w:rPr>
@@ -1007,7 +982,6 @@
             <w:tc>
               <w:tcPr>
                 <w:tcW w:w="2355" w:type="dxa"/>
-                <w:shd w:val="clear" w:color="auto" w:fill="auto"/>
                 <w:tcMar>
                   <w:top w:w="100" w:type="dxa"/>
                   <w:left w:w="100" w:type="dxa"/>
@@ -1027,14 +1001,14 @@
                   </w:pBdr>
                   <w:spacing w:after="0" w:line="240" w:lineRule="auto"/>
                   <w:rPr>
-                    <w:rFonts w:ascii="Arial" w:eastAsia="Arial" w:hAnsi="Arial" w:cs="Arial"/>
+                    <w:rFonts w:eastAsia="Arial" w:cs="Arial"/>
                     <w:color w:val="FF0000"/>
                     <w:highlight w:val="yellow"/>
                   </w:rPr>
                 </w:pPr>
                 <w:r>
                   <w:rPr>
-                    <w:rFonts w:ascii="Arial" w:eastAsia="Arial" w:hAnsi="Arial" w:cs="Arial"/>
+                    <w:rFonts w:eastAsia="Arial" w:cs="Arial"/>
                     <w:color w:val="FF0000"/>
                     <w:highlight w:val="yellow"/>
                   </w:rPr>
@@ -1047,7 +1021,6 @@
             <w:tc>
               <w:tcPr>
                 <w:tcW w:w="2565" w:type="dxa"/>
-                <w:shd w:val="clear" w:color="auto" w:fill="auto"/>
                 <w:tcMar>
                   <w:top w:w="100" w:type="dxa"/>
                   <w:left w:w="100" w:type="dxa"/>
@@ -1067,14 +1040,14 @@
                   </w:pBdr>
                   <w:spacing w:after="0" w:line="240" w:lineRule="auto"/>
                   <w:rPr>
-                    <w:rFonts w:ascii="Arial" w:eastAsia="Arial" w:hAnsi="Arial" w:cs="Arial"/>
+                    <w:rFonts w:eastAsia="Arial" w:cs="Arial"/>
                     <w:color w:val="FF0000"/>
                     <w:highlight w:val="yellow"/>
                   </w:rPr>
                 </w:pPr>
                 <w:r>
                   <w:rPr>
-                    <w:rFonts w:ascii="Arial" w:eastAsia="Arial" w:hAnsi="Arial" w:cs="Arial"/>
+                    <w:rFonts w:eastAsia="Arial" w:cs="Arial"/>
                     <w:color w:val="FF0000"/>
                     <w:highlight w:val="yellow"/>
                   </w:rPr>
@@ -1085,7 +1058,6 @@
             <w:tc>
               <w:tcPr>
                 <w:tcW w:w="3450" w:type="dxa"/>
-                <w:shd w:val="clear" w:color="auto" w:fill="auto"/>
                 <w:tcMar>
                   <w:top w:w="100" w:type="dxa"/>
                   <w:left w:w="100" w:type="dxa"/>
@@ -1105,14 +1077,14 @@
                   </w:pBdr>
                   <w:spacing w:after="0" w:line="240" w:lineRule="auto"/>
                   <w:rPr>
-                    <w:rFonts w:ascii="Arial" w:eastAsia="Arial" w:hAnsi="Arial" w:cs="Arial"/>
+                    <w:rFonts w:eastAsia="Arial" w:cs="Arial"/>
                     <w:color w:val="FF0000"/>
                     <w:highlight w:val="yellow"/>
                   </w:rPr>
                 </w:pPr>
                 <w:r>
                   <w:rPr>
-                    <w:rFonts w:ascii="Arial" w:eastAsia="Arial" w:hAnsi="Arial" w:cs="Arial"/>
+                    <w:rFonts w:eastAsia="Arial" w:cs="Arial"/>
                     <w:color w:val="FF0000"/>
                     <w:highlight w:val="yellow"/>
                   </w:rPr>
@@ -1123,7 +1095,6 @@
             <w:tc>
               <w:tcPr>
                 <w:tcW w:w="2355" w:type="dxa"/>
-                <w:shd w:val="clear" w:color="auto" w:fill="auto"/>
                 <w:tcMar>
                   <w:top w:w="100" w:type="dxa"/>
                   <w:left w:w="100" w:type="dxa"/>
@@ -1143,14 +1114,14 @@
                   </w:pBdr>
                   <w:spacing w:after="0" w:line="240" w:lineRule="auto"/>
                   <w:rPr>
-                    <w:rFonts w:ascii="Arial" w:eastAsia="Arial" w:hAnsi="Arial" w:cs="Arial"/>
+                    <w:rFonts w:eastAsia="Arial" w:cs="Arial"/>
                     <w:color w:val="FF0000"/>
                     <w:highlight w:val="yellow"/>
                   </w:rPr>
                 </w:pPr>
                 <w:r>
                   <w:rPr>
-                    <w:rFonts w:ascii="Arial" w:eastAsia="Arial" w:hAnsi="Arial" w:cs="Arial"/>
+                    <w:rFonts w:eastAsia="Arial" w:cs="Arial"/>
                     <w:color w:val="FF0000"/>
                     <w:highlight w:val="yellow"/>
                   </w:rPr>
@@ -1163,7 +1134,6 @@
             <w:tc>
               <w:tcPr>
                 <w:tcW w:w="2565" w:type="dxa"/>
-                <w:shd w:val="clear" w:color="auto" w:fill="auto"/>
                 <w:tcMar>
                   <w:top w:w="100" w:type="dxa"/>
                   <w:left w:w="100" w:type="dxa"/>
@@ -1183,14 +1153,14 @@
                   </w:pBdr>
                   <w:spacing w:after="0" w:line="240" w:lineRule="auto"/>
                   <w:rPr>
-                    <w:rFonts w:ascii="Arial" w:eastAsia="Arial" w:hAnsi="Arial" w:cs="Arial"/>
+                    <w:rFonts w:eastAsia="Arial" w:cs="Arial"/>
                     <w:color w:val="FF0000"/>
                     <w:highlight w:val="yellow"/>
                   </w:rPr>
                 </w:pPr>
                 <w:r>
                   <w:rPr>
-                    <w:rFonts w:ascii="Arial" w:eastAsia="Arial" w:hAnsi="Arial" w:cs="Arial"/>
+                    <w:rFonts w:eastAsia="Arial" w:cs="Arial"/>
                     <w:color w:val="FF0000"/>
                     <w:highlight w:val="yellow"/>
                   </w:rPr>
@@ -1201,7 +1171,6 @@
             <w:tc>
               <w:tcPr>
                 <w:tcW w:w="3450" w:type="dxa"/>
-                <w:shd w:val="clear" w:color="auto" w:fill="auto"/>
                 <w:tcMar>
                   <w:top w:w="100" w:type="dxa"/>
                   <w:left w:w="100" w:type="dxa"/>
@@ -1221,14 +1190,14 @@
                   </w:pBdr>
                   <w:spacing w:after="0" w:line="240" w:lineRule="auto"/>
                   <w:rPr>
-                    <w:rFonts w:ascii="Arial" w:eastAsia="Arial" w:hAnsi="Arial" w:cs="Arial"/>
+                    <w:rFonts w:eastAsia="Arial" w:cs="Arial"/>
                     <w:color w:val="FF0000"/>
                     <w:highlight w:val="yellow"/>
                   </w:rPr>
                 </w:pPr>
                 <w:r>
                   <w:rPr>
-                    <w:rFonts w:ascii="Arial" w:eastAsia="Arial" w:hAnsi="Arial" w:cs="Arial"/>
+                    <w:rFonts w:eastAsia="Arial" w:cs="Arial"/>
                     <w:color w:val="FF0000"/>
                     <w:highlight w:val="yellow"/>
                   </w:rPr>
@@ -1239,7 +1208,6 @@
             <w:tc>
               <w:tcPr>
                 <w:tcW w:w="2355" w:type="dxa"/>
-                <w:shd w:val="clear" w:color="auto" w:fill="auto"/>
                 <w:tcMar>
                   <w:top w:w="100" w:type="dxa"/>
                   <w:left w:w="100" w:type="dxa"/>
@@ -1259,14 +1227,14 @@
                   </w:pBdr>
                   <w:spacing w:after="0" w:line="240" w:lineRule="auto"/>
                   <w:rPr>
-                    <w:rFonts w:ascii="Arial" w:eastAsia="Arial" w:hAnsi="Arial" w:cs="Arial"/>
+                    <w:rFonts w:eastAsia="Arial" w:cs="Arial"/>
                     <w:color w:val="FF0000"/>
                     <w:highlight w:val="yellow"/>
                   </w:rPr>
                 </w:pPr>
                 <w:r>
                   <w:rPr>
-                    <w:rFonts w:ascii="Arial" w:eastAsia="Arial" w:hAnsi="Arial" w:cs="Arial"/>
+                    <w:rFonts w:eastAsia="Arial" w:cs="Arial"/>
                     <w:color w:val="FF0000"/>
                     <w:highlight w:val="yellow"/>
                   </w:rPr>
@@ -1279,7 +1247,6 @@
             <w:tc>
               <w:tcPr>
                 <w:tcW w:w="2565" w:type="dxa"/>
-                <w:shd w:val="clear" w:color="auto" w:fill="auto"/>
                 <w:tcMar>
                   <w:top w:w="100" w:type="dxa"/>
                   <w:left w:w="100" w:type="dxa"/>
@@ -1292,14 +1259,14 @@
                   <w:widowControl w:val="0"/>
                   <w:spacing w:after="0" w:line="240" w:lineRule="auto"/>
                   <w:rPr>
-                    <w:rFonts w:ascii="Arial" w:eastAsia="Arial" w:hAnsi="Arial" w:cs="Arial"/>
+                    <w:rFonts w:eastAsia="Arial" w:cs="Arial"/>
                     <w:color w:val="FF0000"/>
                     <w:highlight w:val="yellow"/>
                   </w:rPr>
                 </w:pPr>
                 <w:r>
                   <w:rPr>
-                    <w:rFonts w:ascii="Arial" w:eastAsia="Arial" w:hAnsi="Arial" w:cs="Arial"/>
+                    <w:rFonts w:eastAsia="Arial" w:cs="Arial"/>
                     <w:color w:val="FF0000"/>
                     <w:highlight w:val="yellow"/>
                   </w:rPr>
@@ -1310,7 +1277,6 @@
             <w:tc>
               <w:tcPr>
                 <w:tcW w:w="3450" w:type="dxa"/>
-                <w:shd w:val="clear" w:color="auto" w:fill="auto"/>
                 <w:tcMar>
                   <w:top w:w="100" w:type="dxa"/>
                   <w:left w:w="100" w:type="dxa"/>
@@ -1323,14 +1289,14 @@
                   <w:widowControl w:val="0"/>
                   <w:spacing w:after="0" w:line="240" w:lineRule="auto"/>
                   <w:rPr>
-                    <w:rFonts w:ascii="Arial" w:eastAsia="Arial" w:hAnsi="Arial" w:cs="Arial"/>
+                    <w:rFonts w:eastAsia="Arial" w:cs="Arial"/>
                     <w:color w:val="FF0000"/>
                     <w:highlight w:val="yellow"/>
                   </w:rPr>
                 </w:pPr>
                 <w:r>
                   <w:rPr>
-                    <w:rFonts w:ascii="Arial" w:eastAsia="Arial" w:hAnsi="Arial" w:cs="Arial"/>
+                    <w:rFonts w:eastAsia="Arial" w:cs="Arial"/>
                     <w:color w:val="FF0000"/>
                     <w:highlight w:val="yellow"/>
                   </w:rPr>
@@ -1341,7 +1307,6 @@
             <w:tc>
               <w:tcPr>
                 <w:tcW w:w="2355" w:type="dxa"/>
-                <w:shd w:val="clear" w:color="auto" w:fill="auto"/>
                 <w:tcMar>
                   <w:top w:w="100" w:type="dxa"/>
                   <w:left w:w="100" w:type="dxa"/>
@@ -1354,14 +1319,14 @@
                   <w:widowControl w:val="0"/>
                   <w:spacing w:after="0" w:line="240" w:lineRule="auto"/>
                   <w:rPr>
-                    <w:rFonts w:ascii="Arial" w:eastAsia="Arial" w:hAnsi="Arial" w:cs="Arial"/>
+                    <w:rFonts w:eastAsia="Arial" w:cs="Arial"/>
                     <w:color w:val="FF0000"/>
                     <w:highlight w:val="yellow"/>
                   </w:rPr>
                 </w:pPr>
                 <w:r>
                   <w:rPr>
-                    <w:rFonts w:ascii="Arial" w:eastAsia="Arial" w:hAnsi="Arial" w:cs="Arial"/>
+                    <w:rFonts w:eastAsia="Arial" w:cs="Arial"/>
                     <w:color w:val="FF0000"/>
                     <w:highlight w:val="yellow"/>
                   </w:rPr>
@@ -1374,7 +1339,6 @@
             <w:tc>
               <w:tcPr>
                 <w:tcW w:w="2565" w:type="dxa"/>
-                <w:shd w:val="clear" w:color="auto" w:fill="auto"/>
                 <w:tcMar>
                   <w:top w:w="100" w:type="dxa"/>
                   <w:left w:w="100" w:type="dxa"/>
@@ -1387,14 +1351,14 @@
                   <w:widowControl w:val="0"/>
                   <w:spacing w:after="0" w:line="240" w:lineRule="auto"/>
                   <w:rPr>
-                    <w:rFonts w:ascii="Arial" w:eastAsia="Arial" w:hAnsi="Arial" w:cs="Arial"/>
+                    <w:rFonts w:eastAsia="Arial" w:cs="Arial"/>
                     <w:color w:val="FF0000"/>
                     <w:highlight w:val="yellow"/>
                   </w:rPr>
                 </w:pPr>
                 <w:r>
                   <w:rPr>
-                    <w:rFonts w:ascii="Arial" w:eastAsia="Arial" w:hAnsi="Arial" w:cs="Arial"/>
+                    <w:rFonts w:eastAsia="Arial" w:cs="Arial"/>
                     <w:color w:val="FF0000"/>
                     <w:highlight w:val="yellow"/>
                   </w:rPr>
@@ -1405,7 +1369,6 @@
             <w:tc>
               <w:tcPr>
                 <w:tcW w:w="3450" w:type="dxa"/>
-                <w:shd w:val="clear" w:color="auto" w:fill="auto"/>
                 <w:tcMar>
                   <w:top w:w="100" w:type="dxa"/>
                   <w:left w:w="100" w:type="dxa"/>
@@ -1418,14 +1381,14 @@
                   <w:widowControl w:val="0"/>
                   <w:spacing w:after="0" w:line="240" w:lineRule="auto"/>
                   <w:rPr>
-                    <w:rFonts w:ascii="Arial" w:eastAsia="Arial" w:hAnsi="Arial" w:cs="Arial"/>
+                    <w:rFonts w:eastAsia="Arial" w:cs="Arial"/>
                     <w:color w:val="FF0000"/>
                     <w:highlight w:val="yellow"/>
                   </w:rPr>
                 </w:pPr>
                 <w:r>
                   <w:rPr>
-                    <w:rFonts w:ascii="Arial" w:eastAsia="Arial" w:hAnsi="Arial" w:cs="Arial"/>
+                    <w:rFonts w:eastAsia="Arial" w:cs="Arial"/>
                     <w:color w:val="FF0000"/>
                     <w:highlight w:val="yellow"/>
                   </w:rPr>
@@ -1436,7 +1399,6 @@
             <w:tc>
               <w:tcPr>
                 <w:tcW w:w="2355" w:type="dxa"/>
-                <w:shd w:val="clear" w:color="auto" w:fill="auto"/>
                 <w:tcMar>
                   <w:top w:w="100" w:type="dxa"/>
                   <w:left w:w="100" w:type="dxa"/>
@@ -1449,14 +1411,14 @@
                   <w:widowControl w:val="0"/>
                   <w:spacing w:after="0" w:line="240" w:lineRule="auto"/>
                   <w:rPr>
-                    <w:rFonts w:ascii="Arial" w:eastAsia="Arial" w:hAnsi="Arial" w:cs="Arial"/>
+                    <w:rFonts w:eastAsia="Arial" w:cs="Arial"/>
                     <w:color w:val="FF0000"/>
                     <w:highlight w:val="yellow"/>
                   </w:rPr>
                 </w:pPr>
                 <w:r>
                   <w:rPr>
-                    <w:rFonts w:ascii="Arial" w:eastAsia="Arial" w:hAnsi="Arial" w:cs="Arial"/>
+                    <w:rFonts w:eastAsia="Arial" w:cs="Arial"/>
                     <w:color w:val="FF0000"/>
                     <w:highlight w:val="yellow"/>
                   </w:rPr>
@@ -1477,33 +1439,22 @@
       </w:r>
     </w:p>
     <w:p>
-      <w:pPr>
-        <w:spacing w:line="360" w:lineRule="auto"/>
-      </w:pPr>
-      <w:r>
-        <w:t>En la I.E. Juan José Farfán de Lancones (Piura), la evaluación de la fluidez oral en primer grado de primaria depende de la percepción subjetiva del docente; en aulas de más de 25 estudiantes resulta inviable monitorear individualmente parámetros como el ritmo, las pausas o la articulación. El presente proyecto desarrolla el Sistema de Retroalimentación por Voz (SRV), una aplicación web que captura la voz del estudiante, la procesa con modelos de inteligencia artificial y entrega una retroalimentación formativa inmediata organizada en tres dimensiones: fluidez oral, vocabulario y coherencia, y expresividad vocal.</w:t>
-      </w:r>
-    </w:p>
-    <w:p>
-      <w:pPr>
-        <w:spacing w:line="360" w:lineRule="auto"/>
-      </w:pPr>
-      <w:r>
-        <w:t>La solución integra reconocimiento automático del habla (faster-whisper), análisis prosódico (Praat/parselmouth) y procesamiento de lenguaje natural en español (spaCy y BETO), sobre una arquitectura cliente-servidor (React + FastAPI + PostgreSQL/Supabase) desplegada sin costo recurrente (Railway y Vercel). El sistema calcula un puntaje global y una calificación por estrellas, genera consejos de mejora, exporta reportes en PDF y ofrece un panel para el docente con control de acceso por roles. Una decisión central del diseño es el procesamiento local de la voz y su eliminación inmediata, para proteger los datos de los menores.</w:t>
-      </w:r>
-    </w:p>
-    <w:p>
-      <w:pPr>
-        <w:spacing w:line="360" w:lineRule="auto"/>
-      </w:pPr>
-      <w:r>
-        <w:t>Como resultado se obtuvo un sistema funcional que cubre prácticamente la totalidad del backlog del producto (alrededor de 48 de 50 ítems), desplegado y validado mediante pruebas de integración automatizadas. El aporte del proyecto no radica en un nuevo algoritmo, sino en la integración del estado del arte en un contexto educativo no atendido (niños de primer grado, zona rural, idioma español) de forma ética y de bajo costo.</w:t>
-      </w:r>
-    </w:p>
-    <w:p>
-      <w:pPr>
-        <w:spacing w:line="360" w:lineRule="auto"/>
-      </w:pPr>
+      <w:r>
+        <w:t>En la educación primaria, la evaluación de la fluidez oral depende en gran medida de la percepción subjetiva del docente; en aulas de más de 25 estudiantes resulta inviable monitorear individualmente parámetros como el ritmo, las pausas o la articulación. El presente proyecto desarrolla el Sistema de Retroalimentación por Voz (SRV), una aplicación web que captura la voz del estudiante, la procesa con modelos de inteligencia artificial y entrega una retroalimentación formativa inmediata organizada en tres dimensiones: fluidez oral, vocabulario y coherencia, y expresividad vocal.</w:t>
+      </w:r>
+    </w:p>
+    <w:p>
+      <w:r>
+        <w:t>La solución integra reconocimiento automático del habla (faster-whisper), análisis prosódico (Praat/parselmouth) y procesamiento de lenguaje natural en español (spaCy y BETO), sobre una arquitectura cliente-servidor (React + FastAPI + PostgreSQL/Supabase) desplegada sin costo recurrente (Railway y Vercel). El sistema calcula un puntaje global y una calificación por estrellas, genera consejos de mejora, exporta reportes en PDF y ofrece un panel para el docente con control de acceso por roles. Una decisión central del diseño es el procesamiento local de la voz y su eliminación inmediata, para proteger los datos de los usuarios.</w:t>
+      </w:r>
+      <w:r/>
+    </w:p>
+    <w:p>
+      <w:r>
+        <w:t>Como resultado se obtuvo un sistema funcional que cubre prácticamente la totalidad del backlog del producto (alrededor de 48 de 50 ítems), desplegado y validado mediante pruebas de integración automatizadas. El aporte del proyecto no radica en un nuevo algoritmo, sino en la integración del estado del arte en un segmento poco atendido (oratoria infantil en español) de forma ética y de bajo costo.</w:t>
+      </w:r>
+    </w:p>
+    <w:p>
       <w:r>
         <w:t>Palabras clave: retroalimentación por voz, fluidez oral, reconocimiento del habla, Whisper, procesamiento de lenguaje natural, educación primaria, prosodia.</w:t>
       </w:r>
@@ -1517,9 +1468,6 @@
       </w:r>
     </w:p>
     <w:p>
-      <w:pPr>
-        <w:spacing w:line="360" w:lineRule="auto"/>
-      </w:pPr>
       <w:r>
         <w:t>Índice del documento, índice de figuras e índice de tablas: se generan automáticamente en Word mediante Referencias → Tabla de contenido / Insertar tabla de ilustraciones, a partir de los estilos de título y los rótulos de figuras y tablas de este documento.</w:t>
       </w:r>
@@ -1537,14 +1485,13 @@
         <w:pStyle w:val="Ttulo2"/>
       </w:pPr>
       <w:r>
-        <w:t>3.1 Datos de la institución y sector</w:t>
+        <w:t>3.1 Dominio de aplicación y sector</w:t>
       </w:r>
     </w:p>
     <w:tbl>
       <w:tblPr>
-        <w:tblW w:type="auto" w:w="0"/>
+        <w:tblW w:w="0" w:type="auto"/>
         <w:jc w:val="center"/>
-        <w:tblLook w:firstColumn="1" w:firstRow="1" w:lastColumn="0" w:lastRow="0" w:noHBand="0" w:noVBand="1" w:val="04A0"/>
         <w:tblBorders>
           <w:top w:val="single" w:sz="4" w:space="0" w:color="BFBFBF"/>
           <w:left w:val="single" w:sz="4" w:space="0" w:color="BFBFBF"/>
@@ -1553,18 +1500,21 @@
           <w:insideH w:val="single" w:sz="4" w:space="0" w:color="BFBFBF"/>
           <w:insideV w:val="single" w:sz="4" w:space="0" w:color="BFBFBF"/>
         </w:tblBorders>
+        <w:tblLook w:val="04A0" w:firstRow="1" w:lastRow="0" w:firstColumn="1" w:lastColumn="0" w:noHBand="0" w:noVBand="1"/>
       </w:tblPr>
       <w:tblGrid>
-        <w:gridCol w:w="4252"/>
-        <w:gridCol w:w="4252"/>
+        <w:gridCol w:w="4247"/>
+        <w:gridCol w:w="4247"/>
       </w:tblGrid>
       <w:tr>
-        <w:tc>
-          <w:tcPr>
-            <w:tcW w:type="dxa" w:w="4252"/>
-          </w:tcPr>
-          <w:p>
-            <w:r/>
+        <w:trPr>
+          <w:jc w:val="center"/>
+        </w:trPr>
+        <w:tc>
+          <w:tcPr>
+            <w:tcW w:w="4252" w:type="dxa"/>
+          </w:tcPr>
+          <w:p>
             <w:r>
               <w:rPr>
                 <w:b/>
@@ -1576,10 +1526,9 @@
         </w:tc>
         <w:tc>
           <w:tcPr>
-            <w:tcW w:type="dxa" w:w="4252"/>
-          </w:tcPr>
-          <w:p>
-            <w:r/>
+            <w:tcW w:w="4252" w:type="dxa"/>
+          </w:tcPr>
+          <w:p>
             <w:r>
               <w:rPr>
                 <w:b/>
@@ -1591,65 +1540,74 @@
         </w:tc>
       </w:tr>
       <w:tr>
-        <w:tc>
-          <w:tcPr>
-            <w:tcW w:type="dxa" w:w="4252"/>
-          </w:tcPr>
-          <w:p>
-            <w:r>
-              <w:rPr>
-                <w:sz w:val="18"/>
-              </w:rPr>
-              <w:t>Institución</w:t>
-            </w:r>
-          </w:p>
-        </w:tc>
-        <w:tc>
-          <w:tcPr>
-            <w:tcW w:type="dxa" w:w="4252"/>
-          </w:tcPr>
-          <w:p>
-            <w:r>
-              <w:rPr>
-                <w:sz w:val="18"/>
-              </w:rPr>
-              <w:t>I.E. Juan José Farfán</w:t>
+        <w:trPr>
+          <w:jc w:val="center"/>
+        </w:trPr>
+        <w:tc>
+          <w:tcPr>
+            <w:tcW w:w="4252" w:type="dxa"/>
+          </w:tcPr>
+          <w:p>
+            <w:r>
+              <w:rPr>
+                <w:sz w:val="18"/>
+              </w:rPr>
+              <w:t>Producto</w:t>
+            </w:r>
+          </w:p>
+        </w:tc>
+        <w:tc>
+          <w:tcPr>
+            <w:tcW w:w="4252" w:type="dxa"/>
+          </w:tcPr>
+          <w:p>
+            <w:r>
+              <w:rPr>
+                <w:sz w:val="18"/>
+              </w:rPr>
+              <w:t>SRV – Sistema de Retroalimentación por Voz (aplicación web)</w:t>
             </w:r>
           </w:p>
         </w:tc>
       </w:tr>
       <w:tr>
-        <w:tc>
-          <w:tcPr>
-            <w:tcW w:type="dxa" w:w="4252"/>
-          </w:tcPr>
-          <w:p>
-            <w:r>
-              <w:rPr>
-                <w:sz w:val="18"/>
-              </w:rPr>
-              <w:t>Ubicación</w:t>
-            </w:r>
-          </w:p>
-        </w:tc>
-        <w:tc>
-          <w:tcPr>
-            <w:tcW w:type="dxa" w:w="4252"/>
-          </w:tcPr>
-          <w:p>
-            <w:r>
-              <w:rPr>
-                <w:sz w:val="18"/>
-              </w:rPr>
-              <w:t>Lancones, Piura - Perú (zona rural)</w:t>
+        <w:trPr>
+          <w:jc w:val="center"/>
+        </w:trPr>
+        <w:tc>
+          <w:tcPr>
+            <w:tcW w:w="4252" w:type="dxa"/>
+          </w:tcPr>
+          <w:p>
+            <w:r>
+              <w:rPr>
+                <w:sz w:val="18"/>
+              </w:rPr>
+              <w:t>Modalidad</w:t>
+            </w:r>
+          </w:p>
+        </w:tc>
+        <w:tc>
+          <w:tcPr>
+            <w:tcW w:w="4252" w:type="dxa"/>
+          </w:tcPr>
+          <w:p>
+            <w:r>
+              <w:rPr>
+                <w:sz w:val="18"/>
+              </w:rPr>
+              <w:t>Aplicación web accesible desde un navegador moderno</w:t>
             </w:r>
           </w:p>
         </w:tc>
       </w:tr>
       <w:tr>
-        <w:tc>
-          <w:tcPr>
-            <w:tcW w:type="dxa" w:w="4252"/>
+        <w:trPr>
+          <w:jc w:val="center"/>
+        </w:trPr>
+        <w:tc>
+          <w:tcPr>
+            <w:tcW w:w="4252" w:type="dxa"/>
           </w:tcPr>
           <w:p>
             <w:r>
@@ -1662,63 +1620,69 @@
         </w:tc>
         <w:tc>
           <w:tcPr>
-            <w:tcW w:type="dxa" w:w="4252"/>
-          </w:tcPr>
-          <w:p>
-            <w:r>
-              <w:rPr>
-                <w:sz w:val="18"/>
-              </w:rPr>
-              <w:t>Educación pública - Educación Básica Regular (primaria)</w:t>
+            <w:tcW w:w="4252" w:type="dxa"/>
+          </w:tcPr>
+          <w:p>
+            <w:r>
+              <w:rPr>
+                <w:sz w:val="18"/>
+              </w:rPr>
+              <w:t>Educación primaria (Educación Básica Regular)</w:t>
             </w:r>
           </w:p>
         </w:tc>
       </w:tr>
       <w:tr>
-        <w:tc>
-          <w:tcPr>
-            <w:tcW w:type="dxa" w:w="4252"/>
-          </w:tcPr>
-          <w:p>
-            <w:r>
-              <w:rPr>
-                <w:sz w:val="18"/>
-              </w:rPr>
-              <w:t>Población objetivo</w:t>
-            </w:r>
-          </w:p>
-        </w:tc>
-        <w:tc>
-          <w:tcPr>
-            <w:tcW w:type="dxa" w:w="4252"/>
-          </w:tcPr>
-          <w:p>
-            <w:r>
-              <w:rPr>
-                <w:sz w:val="18"/>
-              </w:rPr>
-              <w:t>Estudiantes de 1.° grado de primaria (~24-25 alumnos)</w:t>
+        <w:trPr>
+          <w:jc w:val="center"/>
+        </w:trPr>
+        <w:tc>
+          <w:tcPr>
+            <w:tcW w:w="4252" w:type="dxa"/>
+          </w:tcPr>
+          <w:p>
+            <w:r>
+              <w:rPr>
+                <w:sz w:val="18"/>
+              </w:rPr>
+              <w:t>Usuarios destinatarios</w:t>
+            </w:r>
+          </w:p>
+        </w:tc>
+        <w:tc>
+          <w:tcPr>
+            <w:tcW w:w="4252" w:type="dxa"/>
+          </w:tcPr>
+          <w:p>
+            <w:r>
+              <w:rPr>
+                <w:sz w:val="18"/>
+              </w:rPr>
+              <w:t>Estudiantes de educación primaria de habla hispana y sus docentes</w:t>
             </w:r>
           </w:p>
         </w:tc>
       </w:tr>
       <w:tr>
-        <w:tc>
-          <w:tcPr>
-            <w:tcW w:type="dxa" w:w="4252"/>
-          </w:tcPr>
-          <w:p>
-            <w:r>
-              <w:rPr>
-                <w:sz w:val="18"/>
-              </w:rPr>
-              <w:t>Patrocinador / Asesor</w:t>
-            </w:r>
-          </w:p>
-        </w:tc>
-        <w:tc>
-          <w:tcPr>
-            <w:tcW w:type="dxa" w:w="4252"/>
+        <w:trPr>
+          <w:jc w:val="center"/>
+        </w:trPr>
+        <w:tc>
+          <w:tcPr>
+            <w:tcW w:w="4252" w:type="dxa"/>
+          </w:tcPr>
+          <w:p>
+            <w:r>
+              <w:rPr>
+                <w:sz w:val="18"/>
+              </w:rPr>
+              <w:t>Docente asesor</w:t>
+            </w:r>
+          </w:p>
+        </w:tc>
+        <w:tc>
+          <w:tcPr>
+            <w:tcW w:w="4252" w:type="dxa"/>
           </w:tcPr>
           <w:p>
             <w:r>
@@ -1737,13 +1701,11 @@
         <w:pStyle w:val="Ttulo2"/>
       </w:pPr>
       <w:r>
+        <w:lastRenderedPageBreak/>
         <w:t>3.2 Alcance del proyecto</w:t>
       </w:r>
     </w:p>
     <w:p>
-      <w:pPr>
-        <w:spacing w:line="360" w:lineRule="auto"/>
-      </w:pPr>
       <w:r>
         <w:t>El proyecto comprende el diseño, desarrollo y despliegue de una aplicación web de retroalimentación por voz que incluye: autenticación segura, captura y procesamiento de audio en el navegador, análisis de fluidez (velocidad, pausas y prosodia), análisis de vocabulario y coherencia, análisis de expresividad vocal, cálculo de un puntaje global, generación de consejos, reportes en PDF, historial y gráficos de progreso, y un panel para el docente con control de acceso por roles.</w:t>
       </w:r>
@@ -1765,11 +1727,8 @@
       </w:r>
     </w:p>
     <w:p>
-      <w:pPr>
-        <w:spacing w:line="360" w:lineRule="auto"/>
-      </w:pPr>
-      <w:r>
-        <w:t>Construir un sistema de retroalimentación por voz basado en inteligencia artificial que evalúe de forma objetiva la fluidez de oratoria de los estudiantes de primer grado de la I.E. Juan José Farfán, complementando la labor del docente.</w:t>
+      <w:r>
+        <w:t>Construir un sistema de retroalimentación por voz basado en inteligencia artificial que evalúe de forma objetiva la fluidez de oratoria en estudiantes de educación primaria y entregue retroalimentación formativa inmediata, complementando la labor del docente.</w:t>
       </w:r>
     </w:p>
     <w:p>
@@ -1782,9 +1741,8 @@
     </w:p>
     <w:tbl>
       <w:tblPr>
-        <w:tblW w:type="auto" w:w="0"/>
+        <w:tblW w:w="0" w:type="auto"/>
         <w:jc w:val="center"/>
-        <w:tblLook w:firstColumn="1" w:firstRow="1" w:lastColumn="0" w:lastRow="0" w:noHBand="0" w:noVBand="1" w:val="04A0"/>
         <w:tblBorders>
           <w:top w:val="single" w:sz="4" w:space="0" w:color="BFBFBF"/>
           <w:left w:val="single" w:sz="4" w:space="0" w:color="BFBFBF"/>
@@ -1793,19 +1751,22 @@
           <w:insideH w:val="single" w:sz="4" w:space="0" w:color="BFBFBF"/>
           <w:insideV w:val="single" w:sz="4" w:space="0" w:color="BFBFBF"/>
         </w:tblBorders>
+        <w:tblLook w:val="04A0" w:firstRow="1" w:lastRow="0" w:firstColumn="1" w:lastColumn="0" w:noHBand="0" w:noVBand="1"/>
       </w:tblPr>
       <w:tblGrid>
-        <w:gridCol w:w="2835"/>
-        <w:gridCol w:w="2835"/>
-        <w:gridCol w:w="2835"/>
+        <w:gridCol w:w="2831"/>
+        <w:gridCol w:w="2831"/>
+        <w:gridCol w:w="2832"/>
       </w:tblGrid>
       <w:tr>
-        <w:tc>
-          <w:tcPr>
-            <w:tcW w:type="dxa" w:w="2835"/>
-          </w:tcPr>
-          <w:p>
-            <w:r/>
+        <w:trPr>
+          <w:jc w:val="center"/>
+        </w:trPr>
+        <w:tc>
+          <w:tcPr>
+            <w:tcW w:w="2835" w:type="dxa"/>
+          </w:tcPr>
+          <w:p>
             <w:r>
               <w:rPr>
                 <w:b/>
@@ -1817,10 +1778,9 @@
         </w:tc>
         <w:tc>
           <w:tcPr>
-            <w:tcW w:type="dxa" w:w="2835"/>
-          </w:tcPr>
-          <w:p>
-            <w:r/>
+            <w:tcW w:w="2835" w:type="dxa"/>
+          </w:tcPr>
+          <w:p>
             <w:r>
               <w:rPr>
                 <w:b/>
@@ -1832,10 +1792,9 @@
         </w:tc>
         <w:tc>
           <w:tcPr>
-            <w:tcW w:type="dxa" w:w="2835"/>
-          </w:tcPr>
-          <w:p>
-            <w:r/>
+            <w:tcW w:w="2835" w:type="dxa"/>
+          </w:tcPr>
+          <w:p>
             <w:r>
               <w:rPr>
                 <w:b/>
@@ -1847,9 +1806,12 @@
         </w:tc>
       </w:tr>
       <w:tr>
-        <w:tc>
-          <w:tcPr>
-            <w:tcW w:type="dxa" w:w="2835"/>
+        <w:trPr>
+          <w:jc w:val="center"/>
+        </w:trPr>
+        <w:tc>
+          <w:tcPr>
+            <w:tcW w:w="2835" w:type="dxa"/>
           </w:tcPr>
           <w:p>
             <w:r>
@@ -1862,7 +1824,7 @@
         </w:tc>
         <w:tc>
           <w:tcPr>
-            <w:tcW w:type="dxa" w:w="2835"/>
+            <w:tcW w:w="2835" w:type="dxa"/>
           </w:tcPr>
           <w:p>
             <w:r>
@@ -1875,7 +1837,7 @@
         </w:tc>
         <w:tc>
           <w:tcPr>
-            <w:tcW w:type="dxa" w:w="2835"/>
+            <w:tcW w:w="2835" w:type="dxa"/>
           </w:tcPr>
           <w:p>
             <w:r>
@@ -1888,9 +1850,12 @@
         </w:tc>
       </w:tr>
       <w:tr>
-        <w:tc>
-          <w:tcPr>
-            <w:tcW w:type="dxa" w:w="2835"/>
+        <w:trPr>
+          <w:jc w:val="center"/>
+        </w:trPr>
+        <w:tc>
+          <w:tcPr>
+            <w:tcW w:w="2835" w:type="dxa"/>
           </w:tcPr>
           <w:p>
             <w:r>
@@ -1903,7 +1868,7 @@
         </w:tc>
         <w:tc>
           <w:tcPr>
-            <w:tcW w:type="dxa" w:w="2835"/>
+            <w:tcW w:w="2835" w:type="dxa"/>
           </w:tcPr>
           <w:p>
             <w:r>
@@ -1916,7 +1881,7 @@
         </w:tc>
         <w:tc>
           <w:tcPr>
-            <w:tcW w:type="dxa" w:w="2835"/>
+            <w:tcW w:w="2835" w:type="dxa"/>
           </w:tcPr>
           <w:p>
             <w:r>
@@ -1929,9 +1894,12 @@
         </w:tc>
       </w:tr>
       <w:tr>
-        <w:tc>
-          <w:tcPr>
-            <w:tcW w:type="dxa" w:w="2835"/>
+        <w:trPr>
+          <w:jc w:val="center"/>
+        </w:trPr>
+        <w:tc>
+          <w:tcPr>
+            <w:tcW w:w="2835" w:type="dxa"/>
           </w:tcPr>
           <w:p>
             <w:r>
@@ -1944,7 +1912,7 @@
         </w:tc>
         <w:tc>
           <w:tcPr>
-            <w:tcW w:type="dxa" w:w="2835"/>
+            <w:tcW w:w="2835" w:type="dxa"/>
           </w:tcPr>
           <w:p>
             <w:r>
@@ -1957,7 +1925,7 @@
         </w:tc>
         <w:tc>
           <w:tcPr>
-            <w:tcW w:type="dxa" w:w="2835"/>
+            <w:tcW w:w="2835" w:type="dxa"/>
           </w:tcPr>
           <w:p>
             <w:r>
@@ -1980,11 +1948,8 @@
       </w:r>
     </w:p>
     <w:p>
-      <w:pPr>
-        <w:spacing w:line="360" w:lineRule="auto"/>
-      </w:pPr>
-      <w:r>
-        <w:t>La retroalimentación docente en oratoria suele ser global y diferida, lo que impide que el niño corrija sus disfluencias en el momento preciso y consolida hábitos de pronunciación inexacta. Un sistema automatizado proporciona una medición objetiva y consistente, reduce el sesgo perceptivo del evaluador y ofrece a cada estudiante un laboratorio de práctica personalizada. Además, genera evidencia del progreso a lo largo del tiempo, útil tanto para el estudiante como para el docente y la investigación.</w:t>
+      <w:r>
+        <w:t>La retroalimentación docente en oratoria suele ser global y diferida, lo que impide que el niño corrija sus disfluencias en el momento preciso y consolida hábitos de pronunciación inexacta. Un sistema automatizado proporciona una medición objetiva y consistente, reduce el sesgo perceptivo del evaluador y ofrece a cada estudiante un laboratorio de práctica personalizada. Además, genera evidencia del progreso a lo largo del tiempo, útil tanto para el estudiante como para el docente.</w:t>
       </w:r>
     </w:p>
     <w:p>
@@ -1992,37 +1957,26 @@
         <w:pStyle w:val="Ttulo2"/>
       </w:pPr>
       <w:r>
+        <w:lastRenderedPageBreak/>
         <w:t>3.5 Exclusiones del proyecto</w:t>
       </w:r>
     </w:p>
     <w:p>
-      <w:pPr>
-        <w:spacing w:line="360" w:lineRule="auto"/>
-      </w:pPr>
       <w:r>
         <w:t>•  Corrección gramatical o sintáctica del discurso (no se evalúa la 'corrección' del contenido).</w:t>
       </w:r>
     </w:p>
     <w:p>
-      <w:pPr>
-        <w:spacing w:line="360" w:lineRule="auto"/>
-      </w:pPr>
       <w:r>
         <w:t>•  Integración con sistemas oficiales del MINEDU (p. ej. SIAGIE).</w:t>
       </w:r>
     </w:p>
     <w:p>
-      <w:pPr>
-        <w:spacing w:line="360" w:lineRule="auto"/>
-      </w:pPr>
       <w:r>
         <w:t>•  Soporte para dispositivos de gama baja sin Web Audio API.</w:t>
       </w:r>
     </w:p>
     <w:p>
-      <w:pPr>
-        <w:spacing w:line="360" w:lineRule="auto"/>
-      </w:pPr>
       <w:r>
         <w:t>•  Entrenamiento de modelos de IA propios desde cero (se usan modelos preentrenados).</w:t>
       </w:r>
@@ -2036,35 +1990,23 @@
       </w:r>
     </w:p>
     <w:p>
-      <w:pPr>
-        <w:spacing w:line="360" w:lineRule="auto"/>
-      </w:pPr>
       <w:r>
         <w:t>•  Equipo de dos integrantes y plazo académico definido (dos sprints).</w:t>
       </w:r>
     </w:p>
     <w:p>
-      <w:pPr>
-        <w:spacing w:line="360" w:lineRule="auto"/>
-      </w:pPr>
       <w:r>
         <w:t>•  Presupuesto limitado: uso de servicios en planes gratuitos.</w:t>
       </w:r>
     </w:p>
     <w:p>
-      <w:pPr>
-        <w:spacing w:line="360" w:lineRule="auto"/>
-      </w:pPr>
       <w:r>
         <w:t>•  Cómputo sin GPU (procesamiento en CPU), lo que condiciona la latencia.</w:t>
       </w:r>
     </w:p>
     <w:p>
-      <w:pPr>
-        <w:spacing w:line="360" w:lineRule="auto"/>
-      </w:pPr>
-      <w:r>
-        <w:t>•  Marco ético-legal estricto por tratarse de menores de edad.</w:t>
+      <w:r>
+        <w:t>•  Protección estricta de datos personales (privacidad por diseño), por tratarse de una herramienta dirigida a niños.</w:t>
       </w:r>
     </w:p>
     <w:p>
@@ -2076,25 +2018,16 @@
       </w:r>
     </w:p>
     <w:p>
-      <w:pPr>
-        <w:spacing w:line="360" w:lineRule="auto"/>
-      </w:pPr>
-      <w:r>
-        <w:t>•  La institución cuenta con conexión a internet y equipos con navegador moderno y micrófono.</w:t>
-      </w:r>
-    </w:p>
-    <w:p>
-      <w:pPr>
-        <w:spacing w:line="360" w:lineRule="auto"/>
-      </w:pPr>
-      <w:r>
-        <w:t>•  Se dispone del consentimiento informado de los padres y el asentimiento de los menores.</w:t>
-      </w:r>
-    </w:p>
-    <w:p>
-      <w:pPr>
-        <w:spacing w:line="360" w:lineRule="auto"/>
-      </w:pPr>
+      <w:r>
+        <w:t>•  El entorno de uso cuenta con conexión a internet y equipos con navegador moderno y micrófono.</w:t>
+      </w:r>
+    </w:p>
+    <w:p>
+      <w:r>
+        <w:t>•  Se cuenta con la autorización correspondiente para el uso de la aplicación por parte de los usuarios.</w:t>
+      </w:r>
+    </w:p>
+    <w:p>
       <w:r>
         <w:t>•  Los estudiantes usan la aplicación de forma voluntaria y supervisada.</w:t>
       </w:r>
@@ -2117,9 +2050,8 @@
     </w:p>
     <w:tbl>
       <w:tblPr>
-        <w:tblW w:type="auto" w:w="0"/>
+        <w:tblW w:w="0" w:type="auto"/>
         <w:jc w:val="center"/>
-        <w:tblLook w:firstColumn="1" w:firstRow="1" w:lastColumn="0" w:lastRow="0" w:noHBand="0" w:noVBand="1" w:val="04A0"/>
         <w:tblBorders>
           <w:top w:val="single" w:sz="4" w:space="0" w:color="BFBFBF"/>
           <w:left w:val="single" w:sz="4" w:space="0" w:color="BFBFBF"/>
@@ -2128,19 +2060,22 @@
           <w:insideH w:val="single" w:sz="4" w:space="0" w:color="BFBFBF"/>
           <w:insideV w:val="single" w:sz="4" w:space="0" w:color="BFBFBF"/>
         </w:tblBorders>
+        <w:tblLook w:val="04A0" w:firstRow="1" w:lastRow="0" w:firstColumn="1" w:lastColumn="0" w:noHBand="0" w:noVBand="1"/>
       </w:tblPr>
       <w:tblGrid>
-        <w:gridCol w:w="2835"/>
-        <w:gridCol w:w="2835"/>
-        <w:gridCol w:w="2835"/>
+        <w:gridCol w:w="2831"/>
+        <w:gridCol w:w="2832"/>
+        <w:gridCol w:w="2831"/>
       </w:tblGrid>
       <w:tr>
-        <w:tc>
-          <w:tcPr>
-            <w:tcW w:type="dxa" w:w="2835"/>
-          </w:tcPr>
-          <w:p>
-            <w:r/>
+        <w:trPr>
+          <w:jc w:val="center"/>
+        </w:trPr>
+        <w:tc>
+          <w:tcPr>
+            <w:tcW w:w="2835" w:type="dxa"/>
+          </w:tcPr>
+          <w:p>
             <w:r>
               <w:rPr>
                 <w:b/>
@@ -2152,10 +2087,9 @@
         </w:tc>
         <w:tc>
           <w:tcPr>
-            <w:tcW w:type="dxa" w:w="2835"/>
-          </w:tcPr>
-          <w:p>
-            <w:r/>
+            <w:tcW w:w="2835" w:type="dxa"/>
+          </w:tcPr>
+          <w:p>
             <w:r>
               <w:rPr>
                 <w:b/>
@@ -2167,10 +2101,9 @@
         </w:tc>
         <w:tc>
           <w:tcPr>
-            <w:tcW w:type="dxa" w:w="2835"/>
-          </w:tcPr>
-          <w:p>
-            <w:r/>
+            <w:tcW w:w="2835" w:type="dxa"/>
+          </w:tcPr>
+          <w:p>
             <w:r>
               <w:rPr>
                 <w:b/>
@@ -2182,22 +2115,26 @@
         </w:tc>
       </w:tr>
       <w:tr>
-        <w:tc>
-          <w:tcPr>
-            <w:tcW w:type="dxa" w:w="2835"/>
-          </w:tcPr>
-          <w:p>
-            <w:r>
-              <w:rPr>
-                <w:sz w:val="18"/>
-              </w:rPr>
+        <w:trPr>
+          <w:jc w:val="center"/>
+        </w:trPr>
+        <w:tc>
+          <w:tcPr>
+            <w:tcW w:w="2835" w:type="dxa"/>
+          </w:tcPr>
+          <w:p>
+            <w:r>
+              <w:rPr>
+                <w:sz w:val="18"/>
+              </w:rPr>
+              <w:lastRenderedPageBreak/>
               <w:t>Scrum</w:t>
             </w:r>
           </w:p>
         </w:tc>
         <w:tc>
           <w:tcPr>
-            <w:tcW w:type="dxa" w:w="2835"/>
+            <w:tcW w:w="2835" w:type="dxa"/>
           </w:tcPr>
           <w:p>
             <w:r>
@@ -2210,7 +2147,7 @@
         </w:tc>
         <w:tc>
           <w:tcPr>
-            <w:tcW w:type="dxa" w:w="2835"/>
+            <w:tcW w:w="2835" w:type="dxa"/>
           </w:tcPr>
           <w:p>
             <w:r>
@@ -2223,9 +2160,12 @@
         </w:tc>
       </w:tr>
       <w:tr>
-        <w:tc>
-          <w:tcPr>
-            <w:tcW w:type="dxa" w:w="2835"/>
+        <w:trPr>
+          <w:jc w:val="center"/>
+        </w:trPr>
+        <w:tc>
+          <w:tcPr>
+            <w:tcW w:w="2835" w:type="dxa"/>
           </w:tcPr>
           <w:p>
             <w:r>
@@ -2238,7 +2178,7 @@
         </w:tc>
         <w:tc>
           <w:tcPr>
-            <w:tcW w:type="dxa" w:w="2835"/>
+            <w:tcW w:w="2835" w:type="dxa"/>
           </w:tcPr>
           <w:p>
             <w:r>
@@ -2251,7 +2191,7 @@
         </w:tc>
         <w:tc>
           <w:tcPr>
-            <w:tcW w:type="dxa" w:w="2835"/>
+            <w:tcW w:w="2835" w:type="dxa"/>
           </w:tcPr>
           <w:p>
             <w:r>
@@ -2264,9 +2204,12 @@
         </w:tc>
       </w:tr>
       <w:tr>
-        <w:tc>
-          <w:tcPr>
-            <w:tcW w:type="dxa" w:w="2835"/>
+        <w:trPr>
+          <w:jc w:val="center"/>
+        </w:trPr>
+        <w:tc>
+          <w:tcPr>
+            <w:tcW w:w="2835" w:type="dxa"/>
           </w:tcPr>
           <w:p>
             <w:r>
@@ -2279,7 +2222,7 @@
         </w:tc>
         <w:tc>
           <w:tcPr>
-            <w:tcW w:type="dxa" w:w="2835"/>
+            <w:tcW w:w="2835" w:type="dxa"/>
           </w:tcPr>
           <w:p>
             <w:r>
@@ -2292,7 +2235,7 @@
         </w:tc>
         <w:tc>
           <w:tcPr>
-            <w:tcW w:type="dxa" w:w="2835"/>
+            <w:tcW w:w="2835" w:type="dxa"/>
           </w:tcPr>
           <w:p>
             <w:r>
@@ -2315,9 +2258,6 @@
       </w:r>
     </w:p>
     <w:p>
-      <w:pPr>
-        <w:spacing w:line="360" w:lineRule="auto"/>
-      </w:pPr>
       <w:r>
         <w:t>Se adoptó un enfoque Scrumban: la planificación se organizó en dos sprints (Scrum) y el seguimiento de las Historias de Usuario (HU) y Tareas Técnicas (TA) se gestionó con un tablero Kanban en Jira. Se incorporaron prácticas de XP como las pruebas de integración automatizadas y la integración continua mediante GitHub.</w:t>
       </w:r>
@@ -2332,9 +2272,8 @@
     </w:p>
     <w:tbl>
       <w:tblPr>
-        <w:tblW w:type="auto" w:w="0"/>
+        <w:tblW w:w="0" w:type="auto"/>
         <w:jc w:val="center"/>
-        <w:tblLook w:firstColumn="1" w:firstRow="1" w:lastColumn="0" w:lastRow="0" w:noHBand="0" w:noVBand="1" w:val="04A0"/>
         <w:tblBorders>
           <w:top w:val="single" w:sz="4" w:space="0" w:color="BFBFBF"/>
           <w:left w:val="single" w:sz="4" w:space="0" w:color="BFBFBF"/>
@@ -2343,19 +2282,22 @@
           <w:insideH w:val="single" w:sz="4" w:space="0" w:color="BFBFBF"/>
           <w:insideV w:val="single" w:sz="4" w:space="0" w:color="BFBFBF"/>
         </w:tblBorders>
+        <w:tblLook w:val="04A0" w:firstRow="1" w:lastRow="0" w:firstColumn="1" w:lastColumn="0" w:noHBand="0" w:noVBand="1"/>
       </w:tblPr>
       <w:tblGrid>
-        <w:gridCol w:w="2835"/>
-        <w:gridCol w:w="2835"/>
-        <w:gridCol w:w="2835"/>
+        <w:gridCol w:w="2830"/>
+        <w:gridCol w:w="2833"/>
+        <w:gridCol w:w="2831"/>
       </w:tblGrid>
       <w:tr>
-        <w:tc>
-          <w:tcPr>
-            <w:tcW w:type="dxa" w:w="2835"/>
-          </w:tcPr>
-          <w:p>
-            <w:r/>
+        <w:trPr>
+          <w:jc w:val="center"/>
+        </w:trPr>
+        <w:tc>
+          <w:tcPr>
+            <w:tcW w:w="2835" w:type="dxa"/>
+          </w:tcPr>
+          <w:p>
             <w:r>
               <w:rPr>
                 <w:b/>
@@ -2367,10 +2309,9 @@
         </w:tc>
         <w:tc>
           <w:tcPr>
-            <w:tcW w:type="dxa" w:w="2835"/>
-          </w:tcPr>
-          <w:p>
-            <w:r/>
+            <w:tcW w:w="2835" w:type="dxa"/>
+          </w:tcPr>
+          <w:p>
             <w:r>
               <w:rPr>
                 <w:b/>
@@ -2382,10 +2323,9 @@
         </w:tc>
         <w:tc>
           <w:tcPr>
-            <w:tcW w:type="dxa" w:w="2835"/>
-          </w:tcPr>
-          <w:p>
-            <w:r/>
+            <w:tcW w:w="2835" w:type="dxa"/>
+          </w:tcPr>
+          <w:p>
             <w:r>
               <w:rPr>
                 <w:b/>
@@ -2397,9 +2337,12 @@
         </w:tc>
       </w:tr>
       <w:tr>
-        <w:tc>
-          <w:tcPr>
-            <w:tcW w:type="dxa" w:w="2835"/>
+        <w:trPr>
+          <w:jc w:val="center"/>
+        </w:trPr>
+        <w:tc>
+          <w:tcPr>
+            <w:tcW w:w="2835" w:type="dxa"/>
           </w:tcPr>
           <w:p>
             <w:r>
@@ -2412,7 +2355,7 @@
         </w:tc>
         <w:tc>
           <w:tcPr>
-            <w:tcW w:type="dxa" w:w="2835"/>
+            <w:tcW w:w="2835" w:type="dxa"/>
           </w:tcPr>
           <w:p>
             <w:r>
@@ -2425,7 +2368,7 @@
         </w:tc>
         <w:tc>
           <w:tcPr>
-            <w:tcW w:type="dxa" w:w="2835"/>
+            <w:tcW w:w="2835" w:type="dxa"/>
           </w:tcPr>
           <w:p>
             <w:r>
@@ -2438,9 +2381,12 @@
         </w:tc>
       </w:tr>
       <w:tr>
-        <w:tc>
-          <w:tcPr>
-            <w:tcW w:type="dxa" w:w="2835"/>
+        <w:trPr>
+          <w:jc w:val="center"/>
+        </w:trPr>
+        <w:tc>
+          <w:tcPr>
+            <w:tcW w:w="2835" w:type="dxa"/>
           </w:tcPr>
           <w:p>
             <w:r>
@@ -2453,7 +2399,7 @@
         </w:tc>
         <w:tc>
           <w:tcPr>
-            <w:tcW w:type="dxa" w:w="2835"/>
+            <w:tcW w:w="2835" w:type="dxa"/>
           </w:tcPr>
           <w:p>
             <w:r>
@@ -2466,7 +2412,7 @@
         </w:tc>
         <w:tc>
           <w:tcPr>
-            <w:tcW w:type="dxa" w:w="2835"/>
+            <w:tcW w:w="2835" w:type="dxa"/>
           </w:tcPr>
           <w:p>
             <w:r>
@@ -2481,9 +2427,6 @@
     </w:tbl>
     <w:p/>
     <w:p>
-      <w:pPr>
-        <w:spacing w:line="360" w:lineRule="auto"/>
-      </w:pPr>
       <w:r>
         <w:t>El producto se organizó en 8 épicas (EP-01 a EP-08) que agrupan 28 Historias de Usuario y 22 Tareas Técnicas (50 ítems, ~190 puntos de historia).</w:t>
       </w:r>
@@ -2506,9 +2449,8 @@
     </w:p>
     <w:tbl>
       <w:tblPr>
-        <w:tblW w:type="auto" w:w="0"/>
+        <w:tblW w:w="0" w:type="auto"/>
         <w:jc w:val="center"/>
-        <w:tblLook w:firstColumn="1" w:firstRow="1" w:lastColumn="0" w:lastRow="0" w:noHBand="0" w:noVBand="1" w:val="04A0"/>
         <w:tblBorders>
           <w:top w:val="single" w:sz="4" w:space="0" w:color="BFBFBF"/>
           <w:left w:val="single" w:sz="4" w:space="0" w:color="BFBFBF"/>
@@ -2517,18 +2459,21 @@
           <w:insideH w:val="single" w:sz="4" w:space="0" w:color="BFBFBF"/>
           <w:insideV w:val="single" w:sz="4" w:space="0" w:color="BFBFBF"/>
         </w:tblBorders>
+        <w:tblLook w:val="04A0" w:firstRow="1" w:lastRow="0" w:firstColumn="1" w:lastColumn="0" w:noHBand="0" w:noVBand="1"/>
       </w:tblPr>
       <w:tblGrid>
-        <w:gridCol w:w="4252"/>
-        <w:gridCol w:w="4252"/>
+        <w:gridCol w:w="4247"/>
+        <w:gridCol w:w="4247"/>
       </w:tblGrid>
       <w:tr>
-        <w:tc>
-          <w:tcPr>
-            <w:tcW w:type="dxa" w:w="4252"/>
-          </w:tcPr>
-          <w:p>
-            <w:r/>
+        <w:trPr>
+          <w:jc w:val="center"/>
+        </w:trPr>
+        <w:tc>
+          <w:tcPr>
+            <w:tcW w:w="4252" w:type="dxa"/>
+          </w:tcPr>
+          <w:p>
             <w:r>
               <w:rPr>
                 <w:b/>
@@ -2540,10 +2485,9 @@
         </w:tc>
         <w:tc>
           <w:tcPr>
-            <w:tcW w:type="dxa" w:w="4252"/>
-          </w:tcPr>
-          <w:p>
-            <w:r/>
+            <w:tcW w:w="4252" w:type="dxa"/>
+          </w:tcPr>
+          <w:p>
             <w:r>
               <w:rPr>
                 <w:b/>
@@ -2555,22 +2499,26 @@
         </w:tc>
       </w:tr>
       <w:tr>
-        <w:tc>
-          <w:tcPr>
-            <w:tcW w:type="dxa" w:w="4252"/>
-          </w:tcPr>
-          <w:p>
-            <w:r>
-              <w:rPr>
-                <w:sz w:val="18"/>
-              </w:rPr>
+        <w:trPr>
+          <w:jc w:val="center"/>
+        </w:trPr>
+        <w:tc>
+          <w:tcPr>
+            <w:tcW w:w="4252" w:type="dxa"/>
+          </w:tcPr>
+          <w:p>
+            <w:r>
+              <w:rPr>
+                <w:sz w:val="18"/>
+              </w:rPr>
+              <w:lastRenderedPageBreak/>
               <w:t>Técnica</w:t>
             </w:r>
           </w:p>
         </w:tc>
         <w:tc>
           <w:tcPr>
-            <w:tcW w:type="dxa" w:w="4252"/>
+            <w:tcW w:w="4252" w:type="dxa"/>
           </w:tcPr>
           <w:p>
             <w:r>
@@ -2583,9 +2531,12 @@
         </w:tc>
       </w:tr>
       <w:tr>
-        <w:tc>
-          <w:tcPr>
-            <w:tcW w:type="dxa" w:w="4252"/>
+        <w:trPr>
+          <w:jc w:val="center"/>
+        </w:trPr>
+        <w:tc>
+          <w:tcPr>
+            <w:tcW w:w="4252" w:type="dxa"/>
           </w:tcPr>
           <w:p>
             <w:r>
@@ -2598,22 +2549,25 @@
         </w:tc>
         <w:tc>
           <w:tcPr>
-            <w:tcW w:type="dxa" w:w="4252"/>
-          </w:tcPr>
-          <w:p>
-            <w:r>
-              <w:rPr>
-                <w:sz w:val="18"/>
-              </w:rPr>
-              <w:t>Viable con consentimiento informado, asentimiento de menores y supervisión del comité de ética; procesamiento local y audio efímero.</w:t>
+            <w:tcW w:w="4252" w:type="dxa"/>
+          </w:tcPr>
+          <w:p>
+            <w:r>
+              <w:rPr>
+                <w:sz w:val="18"/>
+              </w:rPr>
+              <w:t>Viable: cumplimiento de la protección de datos personales mediante procesamiento local y audio efímero (privacidad por diseño).</w:t>
             </w:r>
           </w:p>
         </w:tc>
       </w:tr>
       <w:tr>
-        <w:tc>
-          <w:tcPr>
-            <w:tcW w:type="dxa" w:w="4252"/>
+        <w:trPr>
+          <w:jc w:val="center"/>
+        </w:trPr>
+        <w:tc>
+          <w:tcPr>
+            <w:tcW w:w="4252" w:type="dxa"/>
           </w:tcPr>
           <w:p>
             <w:r>
@@ -2626,7 +2580,7 @@
         </w:tc>
         <w:tc>
           <w:tcPr>
-            <w:tcW w:type="dxa" w:w="4252"/>
+            <w:tcW w:w="4252" w:type="dxa"/>
           </w:tcPr>
           <w:p>
             <w:r>
@@ -2639,9 +2593,12 @@
         </w:tc>
       </w:tr>
       <w:tr>
-        <w:tc>
-          <w:tcPr>
-            <w:tcW w:type="dxa" w:w="4252"/>
+        <w:trPr>
+          <w:jc w:val="center"/>
+        </w:trPr>
+        <w:tc>
+          <w:tcPr>
+            <w:tcW w:w="4252" w:type="dxa"/>
           </w:tcPr>
           <w:p>
             <w:r>
@@ -2654,7 +2611,7 @@
         </w:tc>
         <w:tc>
           <w:tcPr>
-            <w:tcW w:type="dxa" w:w="4252"/>
+            <w:tcW w:w="4252" w:type="dxa"/>
           </w:tcPr>
           <w:p>
             <w:r>
@@ -2667,9 +2624,12 @@
         </w:tc>
       </w:tr>
       <w:tr>
-        <w:tc>
-          <w:tcPr>
-            <w:tcW w:type="dxa" w:w="4252"/>
+        <w:trPr>
+          <w:jc w:val="center"/>
+        </w:trPr>
+        <w:tc>
+          <w:tcPr>
+            <w:tcW w:w="4252" w:type="dxa"/>
           </w:tcPr>
           <w:p>
             <w:r>
@@ -2682,22 +2642,25 @@
         </w:tc>
         <w:tc>
           <w:tcPr>
-            <w:tcW w:type="dxa" w:w="4252"/>
-          </w:tcPr>
-          <w:p>
-            <w:r>
-              <w:rPr>
-                <w:sz w:val="18"/>
-              </w:rPr>
-              <w:t>Dos estudiantes de Ingeniería de Sistemas e IA; asesoría del docente patrocinador.</w:t>
+            <w:tcW w:w="4252" w:type="dxa"/>
+          </w:tcPr>
+          <w:p>
+            <w:r>
+              <w:rPr>
+                <w:sz w:val="18"/>
+              </w:rPr>
+              <w:t>Dos estudiantes de Ingeniería de Sistemas e IA con roles definidos; asesoría del docente.</w:t>
             </w:r>
           </w:p>
         </w:tc>
       </w:tr>
       <w:tr>
-        <w:tc>
-          <w:tcPr>
-            <w:tcW w:type="dxa" w:w="4252"/>
+        <w:trPr>
+          <w:jc w:val="center"/>
+        </w:trPr>
+        <w:tc>
+          <w:tcPr>
+            <w:tcW w:w="4252" w:type="dxa"/>
           </w:tcPr>
           <w:p>
             <w:r>
@@ -2710,7 +2673,7 @@
         </w:tc>
         <w:tc>
           <w:tcPr>
-            <w:tcW w:type="dxa" w:w="4252"/>
+            <w:tcW w:w="4252" w:type="dxa"/>
           </w:tcPr>
           <w:p>
             <w:r>
@@ -2723,9 +2686,12 @@
         </w:tc>
       </w:tr>
       <w:tr>
-        <w:tc>
-          <w:tcPr>
-            <w:tcW w:type="dxa" w:w="4252"/>
+        <w:trPr>
+          <w:jc w:val="center"/>
+        </w:trPr>
+        <w:tc>
+          <w:tcPr>
+            <w:tcW w:w="4252" w:type="dxa"/>
           </w:tcPr>
           <w:p>
             <w:r>
@@ -2738,14 +2704,14 @@
         </w:tc>
         <w:tc>
           <w:tcPr>
-            <w:tcW w:type="dxa" w:w="4252"/>
-          </w:tcPr>
-          <w:p>
-            <w:r>
-              <w:rPr>
-                <w:sz w:val="18"/>
-              </w:rPr>
-              <w:t>Ruido del aula, conectividad rural, WER en voz infantil y límites de memoria en despliegue (ver mitigaciones).</w:t>
+            <w:tcW w:w="4252" w:type="dxa"/>
+          </w:tcPr>
+          <w:p>
+            <w:r>
+              <w:rPr>
+                <w:sz w:val="18"/>
+              </w:rPr>
+              <w:t>Ruido ambiental, conectividad, WER en voz infantil y límites de memoria en despliegue (ver mitigaciones).</w:t>
             </w:r>
           </w:p>
         </w:tc>
@@ -2762,9 +2728,8 @@
     </w:p>
     <w:tbl>
       <w:tblPr>
-        <w:tblW w:type="auto" w:w="0"/>
+        <w:tblW w:w="0" w:type="auto"/>
         <w:jc w:val="center"/>
-        <w:tblLook w:firstColumn="1" w:firstRow="1" w:lastColumn="0" w:lastRow="0" w:noHBand="0" w:noVBand="1" w:val="04A0"/>
         <w:tblBorders>
           <w:top w:val="single" w:sz="4" w:space="0" w:color="BFBFBF"/>
           <w:left w:val="single" w:sz="4" w:space="0" w:color="BFBFBF"/>
@@ -2773,18 +2738,21 @@
           <w:insideH w:val="single" w:sz="4" w:space="0" w:color="BFBFBF"/>
           <w:insideV w:val="single" w:sz="4" w:space="0" w:color="BFBFBF"/>
         </w:tblBorders>
+        <w:tblLook w:val="04A0" w:firstRow="1" w:lastRow="0" w:firstColumn="1" w:lastColumn="0" w:noHBand="0" w:noVBand="1"/>
       </w:tblPr>
       <w:tblGrid>
-        <w:gridCol w:w="4252"/>
-        <w:gridCol w:w="4252"/>
+        <w:gridCol w:w="4247"/>
+        <w:gridCol w:w="4247"/>
       </w:tblGrid>
       <w:tr>
-        <w:tc>
-          <w:tcPr>
-            <w:tcW w:type="dxa" w:w="4252"/>
-          </w:tcPr>
-          <w:p>
-            <w:r/>
+        <w:trPr>
+          <w:jc w:val="center"/>
+        </w:trPr>
+        <w:tc>
+          <w:tcPr>
+            <w:tcW w:w="4252" w:type="dxa"/>
+          </w:tcPr>
+          <w:p>
             <w:r>
               <w:rPr>
                 <w:b/>
@@ -2796,10 +2764,9 @@
         </w:tc>
         <w:tc>
           <w:tcPr>
-            <w:tcW w:type="dxa" w:w="4252"/>
-          </w:tcPr>
-          <w:p>
-            <w:r/>
+            <w:tcW w:w="4252" w:type="dxa"/>
+          </w:tcPr>
+          <w:p>
             <w:r>
               <w:rPr>
                 <w:b/>
@@ -2811,22 +2778,25 @@
         </w:tc>
       </w:tr>
       <w:tr>
-        <w:tc>
-          <w:tcPr>
-            <w:tcW w:type="dxa" w:w="4252"/>
-          </w:tcPr>
-          <w:p>
-            <w:r>
-              <w:rPr>
-                <w:sz w:val="18"/>
-              </w:rPr>
-              <w:t>Ruido ambiental del aula rural</w:t>
-            </w:r>
-          </w:p>
-        </w:tc>
-        <w:tc>
-          <w:tcPr>
-            <w:tcW w:type="dxa" w:w="4252"/>
+        <w:trPr>
+          <w:jc w:val="center"/>
+        </w:trPr>
+        <w:tc>
+          <w:tcPr>
+            <w:tcW w:w="4252" w:type="dxa"/>
+          </w:tcPr>
+          <w:p>
+            <w:r>
+              <w:rPr>
+                <w:sz w:val="18"/>
+              </w:rPr>
+              <w:t>Ruido ambiental del entorno</w:t>
+            </w:r>
+          </w:p>
+        </w:tc>
+        <w:tc>
+          <w:tcPr>
+            <w:tcW w:w="4252" w:type="dxa"/>
           </w:tcPr>
           <w:p>
             <w:r>
@@ -2839,9 +2809,12 @@
         </w:tc>
       </w:tr>
       <w:tr>
-        <w:tc>
-          <w:tcPr>
-            <w:tcW w:type="dxa" w:w="4252"/>
+        <w:trPr>
+          <w:jc w:val="center"/>
+        </w:trPr>
+        <w:tc>
+          <w:tcPr>
+            <w:tcW w:w="4252" w:type="dxa"/>
           </w:tcPr>
           <w:p>
             <w:r>
@@ -2854,7 +2827,7 @@
         </w:tc>
         <w:tc>
           <w:tcPr>
-            <w:tcW w:type="dxa" w:w="4252"/>
+            <w:tcW w:w="4252" w:type="dxa"/>
           </w:tcPr>
           <w:p>
             <w:r>
@@ -2867,9 +2840,12 @@
         </w:tc>
       </w:tr>
       <w:tr>
-        <w:tc>
-          <w:tcPr>
-            <w:tcW w:type="dxa" w:w="4252"/>
+        <w:trPr>
+          <w:jc w:val="center"/>
+        </w:trPr>
+        <w:tc>
+          <w:tcPr>
+            <w:tcW w:w="4252" w:type="dxa"/>
           </w:tcPr>
           <w:p>
             <w:r>
@@ -2882,7 +2858,7 @@
         </w:tc>
         <w:tc>
           <w:tcPr>
-            <w:tcW w:type="dxa" w:w="4252"/>
+            <w:tcW w:w="4252" w:type="dxa"/>
           </w:tcPr>
           <w:p>
             <w:r>
@@ -2895,9 +2871,12 @@
         </w:tc>
       </w:tr>
       <w:tr>
-        <w:tc>
-          <w:tcPr>
-            <w:tcW w:type="dxa" w:w="4252"/>
+        <w:trPr>
+          <w:jc w:val="center"/>
+        </w:trPr>
+        <w:tc>
+          <w:tcPr>
+            <w:tcW w:w="4252" w:type="dxa"/>
           </w:tcPr>
           <w:p>
             <w:r>
@@ -2910,7 +2889,7 @@
         </w:tc>
         <w:tc>
           <w:tcPr>
-            <w:tcW w:type="dxa" w:w="4252"/>
+            <w:tcW w:w="4252" w:type="dxa"/>
           </w:tcPr>
           <w:p>
             <w:r>
@@ -2923,29 +2902,32 @@
         </w:tc>
       </w:tr>
       <w:tr>
-        <w:tc>
-          <w:tcPr>
-            <w:tcW w:type="dxa" w:w="4252"/>
-          </w:tcPr>
-          <w:p>
-            <w:r>
-              <w:rPr>
-                <w:sz w:val="18"/>
-              </w:rPr>
-              <w:t>Datos sensibles de menores</w:t>
-            </w:r>
-          </w:p>
-        </w:tc>
-        <w:tc>
-          <w:tcPr>
-            <w:tcW w:type="dxa" w:w="4252"/>
-          </w:tcPr>
-          <w:p>
-            <w:r>
-              <w:rPr>
-                <w:sz w:val="18"/>
-              </w:rPr>
-              <w:t>Procesamiento local, audio efímero y consentimiento informado.</w:t>
+        <w:trPr>
+          <w:jc w:val="center"/>
+        </w:trPr>
+        <w:tc>
+          <w:tcPr>
+            <w:tcW w:w="4252" w:type="dxa"/>
+          </w:tcPr>
+          <w:p>
+            <w:r>
+              <w:rPr>
+                <w:sz w:val="18"/>
+              </w:rPr>
+              <w:t>Datos personales sensibles</w:t>
+            </w:r>
+          </w:p>
+        </w:tc>
+        <w:tc>
+          <w:tcPr>
+            <w:tcW w:w="4252" w:type="dxa"/>
+          </w:tcPr>
+          <w:p>
+            <w:r>
+              <w:rPr>
+                <w:sz w:val="18"/>
+              </w:rPr>
+              <w:t>Procesamiento local y audio efímero (privacidad por diseño).</w:t>
             </w:r>
           </w:p>
         </w:tc>
@@ -2961,10 +2943,8 @@
       </w:r>
     </w:p>
     <w:p>
-      <w:pPr>
-        <w:spacing w:line="360" w:lineRule="auto"/>
-      </w:pPr>
-      <w:r>
+      <w:r>
+        <w:lastRenderedPageBreak/>
         <w:t>Al reformular la arquitectura hacia servicios gestionados en planes gratuitos (Railway, Supabase y Vercel) y reconocimiento del habla local (en lugar de un servicio en la nube de pago), el costo operativo recurrente se reduce prácticamente a cero.</w:t>
       </w:r>
     </w:p>
@@ -2978,9 +2958,8 @@
     </w:p>
     <w:tbl>
       <w:tblPr>
-        <w:tblW w:type="auto" w:w="0"/>
+        <w:tblW w:w="0" w:type="auto"/>
         <w:jc w:val="center"/>
-        <w:tblLook w:firstColumn="1" w:firstRow="1" w:lastColumn="0" w:lastRow="0" w:noHBand="0" w:noVBand="1" w:val="04A0"/>
         <w:tblBorders>
           <w:top w:val="single" w:sz="4" w:space="0" w:color="BFBFBF"/>
           <w:left w:val="single" w:sz="4" w:space="0" w:color="BFBFBF"/>
@@ -2989,18 +2968,21 @@
           <w:insideH w:val="single" w:sz="4" w:space="0" w:color="BFBFBF"/>
           <w:insideV w:val="single" w:sz="4" w:space="0" w:color="BFBFBF"/>
         </w:tblBorders>
+        <w:tblLook w:val="04A0" w:firstRow="1" w:lastRow="0" w:firstColumn="1" w:lastColumn="0" w:noHBand="0" w:noVBand="1"/>
       </w:tblPr>
       <w:tblGrid>
-        <w:gridCol w:w="4252"/>
-        <w:gridCol w:w="4252"/>
+        <w:gridCol w:w="4247"/>
+        <w:gridCol w:w="4247"/>
       </w:tblGrid>
       <w:tr>
-        <w:tc>
-          <w:tcPr>
-            <w:tcW w:type="dxa" w:w="4252"/>
-          </w:tcPr>
-          <w:p>
-            <w:r/>
+        <w:trPr>
+          <w:jc w:val="center"/>
+        </w:trPr>
+        <w:tc>
+          <w:tcPr>
+            <w:tcW w:w="4252" w:type="dxa"/>
+          </w:tcPr>
+          <w:p>
             <w:r>
               <w:rPr>
                 <w:b/>
@@ -3012,10 +2994,9 @@
         </w:tc>
         <w:tc>
           <w:tcPr>
-            <w:tcW w:type="dxa" w:w="4252"/>
-          </w:tcPr>
-          <w:p>
-            <w:r/>
+            <w:tcW w:w="4252" w:type="dxa"/>
+          </w:tcPr>
+          <w:p>
             <w:r>
               <w:rPr>
                 <w:b/>
@@ -3027,9 +3008,12 @@
         </w:tc>
       </w:tr>
       <w:tr>
-        <w:tc>
-          <w:tcPr>
-            <w:tcW w:type="dxa" w:w="4252"/>
+        <w:trPr>
+          <w:jc w:val="center"/>
+        </w:trPr>
+        <w:tc>
+          <w:tcPr>
+            <w:tcW w:w="4252" w:type="dxa"/>
           </w:tcPr>
           <w:p>
             <w:r>
@@ -3042,7 +3026,7 @@
         </w:tc>
         <w:tc>
           <w:tcPr>
-            <w:tcW w:type="dxa" w:w="4252"/>
+            <w:tcW w:w="4252" w:type="dxa"/>
           </w:tcPr>
           <w:p>
             <w:r>
@@ -3055,9 +3039,12 @@
         </w:tc>
       </w:tr>
       <w:tr>
-        <w:tc>
-          <w:tcPr>
-            <w:tcW w:type="dxa" w:w="4252"/>
+        <w:trPr>
+          <w:jc w:val="center"/>
+        </w:trPr>
+        <w:tc>
+          <w:tcPr>
+            <w:tcW w:w="4252" w:type="dxa"/>
           </w:tcPr>
           <w:p>
             <w:r>
@@ -3070,7 +3057,7 @@
         </w:tc>
         <w:tc>
           <w:tcPr>
-            <w:tcW w:type="dxa" w:w="4252"/>
+            <w:tcW w:w="4252" w:type="dxa"/>
           </w:tcPr>
           <w:p>
             <w:r>
@@ -3083,9 +3070,12 @@
         </w:tc>
       </w:tr>
       <w:tr>
-        <w:tc>
-          <w:tcPr>
-            <w:tcW w:type="dxa" w:w="4252"/>
+        <w:trPr>
+          <w:jc w:val="center"/>
+        </w:trPr>
+        <w:tc>
+          <w:tcPr>
+            <w:tcW w:w="4252" w:type="dxa"/>
           </w:tcPr>
           <w:p>
             <w:r>
@@ -3098,7 +3088,7 @@
         </w:tc>
         <w:tc>
           <w:tcPr>
-            <w:tcW w:type="dxa" w:w="4252"/>
+            <w:tcW w:w="4252" w:type="dxa"/>
           </w:tcPr>
           <w:p>
             <w:r>
@@ -3111,9 +3101,12 @@
         </w:tc>
       </w:tr>
       <w:tr>
-        <w:tc>
-          <w:tcPr>
-            <w:tcW w:type="dxa" w:w="4252"/>
+        <w:trPr>
+          <w:jc w:val="center"/>
+        </w:trPr>
+        <w:tc>
+          <w:tcPr>
+            <w:tcW w:w="4252" w:type="dxa"/>
           </w:tcPr>
           <w:p>
             <w:r>
@@ -3126,7 +3119,7 @@
         </w:tc>
         <w:tc>
           <w:tcPr>
-            <w:tcW w:type="dxa" w:w="4252"/>
+            <w:tcW w:w="4252" w:type="dxa"/>
           </w:tcPr>
           <w:p>
             <w:r>
@@ -3150,9 +3143,8 @@
     </w:p>
     <w:tbl>
       <w:tblPr>
-        <w:tblW w:type="auto" w:w="0"/>
+        <w:tblW w:w="0" w:type="auto"/>
         <w:jc w:val="center"/>
-        <w:tblLook w:firstColumn="1" w:firstRow="1" w:lastColumn="0" w:lastRow="0" w:noHBand="0" w:noVBand="1" w:val="04A0"/>
         <w:tblBorders>
           <w:top w:val="single" w:sz="4" w:space="0" w:color="BFBFBF"/>
           <w:left w:val="single" w:sz="4" w:space="0" w:color="BFBFBF"/>
@@ -3161,18 +3153,21 @@
           <w:insideH w:val="single" w:sz="4" w:space="0" w:color="BFBFBF"/>
           <w:insideV w:val="single" w:sz="4" w:space="0" w:color="BFBFBF"/>
         </w:tblBorders>
+        <w:tblLook w:val="04A0" w:firstRow="1" w:lastRow="0" w:firstColumn="1" w:lastColumn="0" w:noHBand="0" w:noVBand="1"/>
       </w:tblPr>
       <w:tblGrid>
-        <w:gridCol w:w="4252"/>
-        <w:gridCol w:w="4252"/>
+        <w:gridCol w:w="4247"/>
+        <w:gridCol w:w="4247"/>
       </w:tblGrid>
       <w:tr>
-        <w:tc>
-          <w:tcPr>
-            <w:tcW w:type="dxa" w:w="4252"/>
-          </w:tcPr>
-          <w:p>
-            <w:r/>
+        <w:trPr>
+          <w:jc w:val="center"/>
+        </w:trPr>
+        <w:tc>
+          <w:tcPr>
+            <w:tcW w:w="4252" w:type="dxa"/>
+          </w:tcPr>
+          <w:p>
             <w:r>
               <w:rPr>
                 <w:b/>
@@ -3184,10 +3179,9 @@
         </w:tc>
         <w:tc>
           <w:tcPr>
-            <w:tcW w:type="dxa" w:w="4252"/>
-          </w:tcPr>
-          <w:p>
-            <w:r/>
+            <w:tcW w:w="4252" w:type="dxa"/>
+          </w:tcPr>
+          <w:p>
             <w:r>
               <w:rPr>
                 <w:b/>
@@ -3199,9 +3193,12 @@
         </w:tc>
       </w:tr>
       <w:tr>
-        <w:tc>
-          <w:tcPr>
-            <w:tcW w:type="dxa" w:w="4252"/>
+        <w:trPr>
+          <w:jc w:val="center"/>
+        </w:trPr>
+        <w:tc>
+          <w:tcPr>
+            <w:tcW w:w="4252" w:type="dxa"/>
           </w:tcPr>
           <w:p>
             <w:r>
@@ -3214,7 +3211,7 @@
         </w:tc>
         <w:tc>
           <w:tcPr>
-            <w:tcW w:type="dxa" w:w="4252"/>
+            <w:tcW w:w="4252" w:type="dxa"/>
           </w:tcPr>
           <w:p>
             <w:r>
@@ -3227,9 +3224,12 @@
         </w:tc>
       </w:tr>
       <w:tr>
-        <w:tc>
-          <w:tcPr>
-            <w:tcW w:type="dxa" w:w="4252"/>
+        <w:trPr>
+          <w:jc w:val="center"/>
+        </w:trPr>
+        <w:tc>
+          <w:tcPr>
+            <w:tcW w:w="4252" w:type="dxa"/>
           </w:tcPr>
           <w:p>
             <w:r>
@@ -3242,7 +3242,7 @@
         </w:tc>
         <w:tc>
           <w:tcPr>
-            <w:tcW w:type="dxa" w:w="4252"/>
+            <w:tcW w:w="4252" w:type="dxa"/>
           </w:tcPr>
           <w:p>
             <w:r>
@@ -3255,9 +3255,12 @@
         </w:tc>
       </w:tr>
       <w:tr>
-        <w:tc>
-          <w:tcPr>
-            <w:tcW w:type="dxa" w:w="4252"/>
+        <w:trPr>
+          <w:jc w:val="center"/>
+        </w:trPr>
+        <w:tc>
+          <w:tcPr>
+            <w:tcW w:w="4252" w:type="dxa"/>
           </w:tcPr>
           <w:p>
             <w:r>
@@ -3270,7 +3273,7 @@
         </w:tc>
         <w:tc>
           <w:tcPr>
-            <w:tcW w:type="dxa" w:w="4252"/>
+            <w:tcW w:w="4252" w:type="dxa"/>
           </w:tcPr>
           <w:p>
             <w:r>
@@ -3283,9 +3286,12 @@
         </w:tc>
       </w:tr>
       <w:tr>
-        <w:tc>
-          <w:tcPr>
-            <w:tcW w:type="dxa" w:w="4252"/>
+        <w:trPr>
+          <w:jc w:val="center"/>
+        </w:trPr>
+        <w:tc>
+          <w:tcPr>
+            <w:tcW w:w="4252" w:type="dxa"/>
           </w:tcPr>
           <w:p>
             <w:r>
@@ -3298,7 +3304,7 @@
         </w:tc>
         <w:tc>
           <w:tcPr>
-            <w:tcW w:type="dxa" w:w="4252"/>
+            <w:tcW w:w="4252" w:type="dxa"/>
           </w:tcPr>
           <w:p>
             <w:r>
@@ -3321,11 +3327,8 @@
       </w:r>
     </w:p>
     <w:p>
-      <w:pPr>
-        <w:spacing w:line="360" w:lineRule="auto"/>
-      </w:pPr>
-      <w:r>
-        <w:t>Por tratarse de un proyecto de investigación académica sin flujo de ingresos, los indicadores VAN y TIR no son aplicables en sentido financiero estricto. El beneficio principal es cualitativo: reducción de la subjetividad en la evaluación, ahorro de horas de evaluación manual del docente (estimado en S/ 500 por su valor de tiempo) y generación de evidencia de progreso. La relación costo-beneficio es favorable dado el bajo costo de operación.</w:t>
+      <w:r>
+        <w:t>Por tratarse de una solución de uso educativo sin flujo de ingresos, los indicadores VAN y TIR no son aplicables en sentido financiero estricto. El beneficio principal es cualitativo: reducción de la subjetividad en la evaluación, ahorro de horas de evaluación manual del docente (estimado en S/ 500 por su valor de tiempo) y generación de evidencia de progreso. La relación costo-beneficio es favorable dado el bajo costo de operación.</w:t>
       </w:r>
     </w:p>
     <w:p>
@@ -3337,9 +3340,6 @@
       </w:r>
     </w:p>
     <w:p>
-      <w:pPr>
-        <w:spacing w:line="360" w:lineRule="auto"/>
-      </w:pPr>
       <w:r>
         <w:t>El desarrollo siguió el plan de dos sprints definido en el numeral 4.3, sobre la arquitectura cliente-servidor descrita en el Anexo de Documentación de Arquitectura.</w:t>
       </w:r>
@@ -3349,45 +3349,31 @@
         <w:pStyle w:val="Ttulo2"/>
       </w:pPr>
       <w:r>
+        <w:lastRenderedPageBreak/>
         <w:t>6.1 Sprint 1 - Núcleo de infraestructura, audio y fluidez (D1)</w:t>
       </w:r>
     </w:p>
     <w:p>
-      <w:pPr>
-        <w:spacing w:line="360" w:lineRule="auto"/>
-      </w:pPr>
       <w:r>
         <w:t>•  Autenticación segura con JWT y hashing Argon2; registro y validación de datos (DTOs).</w:t>
       </w:r>
     </w:p>
     <w:p>
-      <w:pPr>
-        <w:spacing w:line="360" w:lineRule="auto"/>
-      </w:pPr>
       <w:r>
         <w:t>•  Captura de audio en el navegador con visualización de onda en tiempo real (WaveSurfer).</w:t>
       </w:r>
     </w:p>
     <w:p>
-      <w:pPr>
-        <w:spacing w:line="360" w:lineRule="auto"/>
-      </w:pPr>
       <w:r>
         <w:t>•  Conversión de audio a WAV 16 kHz (PyAV) y transcripción con faster-whisper.</w:t>
       </w:r>
     </w:p>
     <w:p>
-      <w:pPr>
-        <w:spacing w:line="360" w:lineRule="auto"/>
-      </w:pPr>
       <w:r>
         <w:t>•  Cálculo de velocidad de habla (PPM), detección de pausas/bloqueos y prosodia con Praat.</w:t>
       </w:r>
     </w:p>
     <w:p>
-      <w:pPr>
-        <w:spacing w:line="360" w:lineRule="auto"/>
-      </w:pPr>
       <w:r>
         <w:t>•  Persistencia de sesiones y resultados en base de datos; historial del alumno.</w:t>
       </w:r>
@@ -3401,65 +3387,41 @@
       </w:r>
     </w:p>
     <w:p>
-      <w:pPr>
-        <w:spacing w:line="360" w:lineRule="auto"/>
-      </w:pPr>
       <w:r>
         <w:t>•  Detección de muletillas y riqueza léxica (TTR) con spaCy; coherencia semántica con BETO.</w:t>
       </w:r>
     </w:p>
     <w:p>
-      <w:pPr>
-        <w:spacing w:line="360" w:lineRule="auto"/>
-      </w:pPr>
       <w:r>
         <w:t>•  Evaluación de expresividad vocal (variación tonal y calidad) como proxy acústico.</w:t>
       </w:r>
     </w:p>
     <w:p>
-      <w:pPr>
-        <w:spacing w:line="360" w:lineRule="auto"/>
-      </w:pPr>
       <w:r>
         <w:t>•  Puntaje global ponderado (0.4·D1 + 0.35·D2 + 0.25·D3) y calificación por estrellas.</w:t>
       </w:r>
     </w:p>
     <w:p>
-      <w:pPr>
-        <w:spacing w:line="360" w:lineRule="auto"/>
-      </w:pPr>
       <w:r>
         <w:t>•  Modo lectura con fidelidad por distancia de Levenshtein.</w:t>
       </w:r>
     </w:p>
     <w:p>
-      <w:pPr>
-        <w:spacing w:line="360" w:lineRule="auto"/>
-      </w:pPr>
       <w:r>
         <w:t>•  Filtros anti-ruido, reportes en PDF, gráficos de progreso (Chart.js) y consejos.</w:t>
       </w:r>
     </w:p>
     <w:p>
-      <w:pPr>
-        <w:spacing w:line="360" w:lineRule="auto"/>
-      </w:pPr>
       <w:r>
         <w:t>•  Control de acceso por roles (RBAC) y panel del docente.</w:t>
       </w:r>
     </w:p>
     <w:p>
-      <w:pPr>
-        <w:spacing w:line="360" w:lineRule="auto"/>
-      </w:pPr>
       <w:r>
         <w:t>•  Consejos con IA generativa (Claude Haiku) de forma opcional, enviando solo métricas numéricas.</w:t>
       </w:r>
     </w:p>
     <w:p>
-      <w:pPr>
-        <w:spacing w:line="360" w:lineRule="auto"/>
-      </w:pPr>
       <w:r>
         <w:t>•  Despliegue en Railway, Supabase y Vercel; pruebas de integración automatizadas.</w:t>
       </w:r>
@@ -3473,18 +3435,18 @@
       </w:r>
     </w:p>
     <w:p>
-      <w:pPr>
-        <w:spacing w:line="360" w:lineRule="auto"/>
-      </w:pPr>
-      <w:r>
-        <w:t>Se obtuvo un sistema web funcional y desplegado que implementa las tres dimensiones de análisis y la totalidad del flujo de retroalimentación. Respecto al backlog del producto (50 ítems), se completaron alrededor de 48; las dos tareas de infraestructura previstas para AWS y migraciones se sustituyeron por alternativas equivalentes (Railway/Supabase y una micro-migración propia).</w:t>
+      <w:r>
+        <w:t xml:space="preserve">Se obtuvo un sistema web funcional y desplegado que implementa las tres dimensiones de análisis y la totalidad del flujo de retroalimentación. Respecto al backlog del producto (50 ítems), se completaron alrededor de 48; las dos tareas de </w:t>
+      </w:r>
+      <w:r>
+        <w:lastRenderedPageBreak/>
+        <w:t>infraestructura previstas para AWS y migraciones se sustituyeron por alternativas equivalentes (Railway/Supabase y una micro-migración propia).</w:t>
       </w:r>
     </w:p>
     <w:tbl>
       <w:tblPr>
-        <w:tblW w:type="auto" w:w="0"/>
+        <w:tblW w:w="0" w:type="auto"/>
         <w:jc w:val="center"/>
-        <w:tblLook w:firstColumn="1" w:firstRow="1" w:lastColumn="0" w:lastRow="0" w:noHBand="0" w:noVBand="1" w:val="04A0"/>
         <w:tblBorders>
           <w:top w:val="single" w:sz="4" w:space="0" w:color="BFBFBF"/>
           <w:left w:val="single" w:sz="4" w:space="0" w:color="BFBFBF"/>
@@ -3493,18 +3455,21 @@
           <w:insideH w:val="single" w:sz="4" w:space="0" w:color="BFBFBF"/>
           <w:insideV w:val="single" w:sz="4" w:space="0" w:color="BFBFBF"/>
         </w:tblBorders>
+        <w:tblLook w:val="04A0" w:firstRow="1" w:lastRow="0" w:firstColumn="1" w:lastColumn="0" w:noHBand="0" w:noVBand="1"/>
       </w:tblPr>
       <w:tblGrid>
-        <w:gridCol w:w="4252"/>
-        <w:gridCol w:w="4252"/>
+        <w:gridCol w:w="4246"/>
+        <w:gridCol w:w="4248"/>
       </w:tblGrid>
       <w:tr>
-        <w:tc>
-          <w:tcPr>
-            <w:tcW w:type="dxa" w:w="4252"/>
-          </w:tcPr>
-          <w:p>
-            <w:r/>
+        <w:trPr>
+          <w:jc w:val="center"/>
+        </w:trPr>
+        <w:tc>
+          <w:tcPr>
+            <w:tcW w:w="4252" w:type="dxa"/>
+          </w:tcPr>
+          <w:p>
             <w:r>
               <w:rPr>
                 <w:b/>
@@ -3516,10 +3481,9 @@
         </w:tc>
         <w:tc>
           <w:tcPr>
-            <w:tcW w:type="dxa" w:w="4252"/>
-          </w:tcPr>
-          <w:p>
-            <w:r/>
+            <w:tcW w:w="4252" w:type="dxa"/>
+          </w:tcPr>
+          <w:p>
             <w:r>
               <w:rPr>
                 <w:b/>
@@ -3531,9 +3495,12 @@
         </w:tc>
       </w:tr>
       <w:tr>
-        <w:tc>
-          <w:tcPr>
-            <w:tcW w:type="dxa" w:w="4252"/>
+        <w:trPr>
+          <w:jc w:val="center"/>
+        </w:trPr>
+        <w:tc>
+          <w:tcPr>
+            <w:tcW w:w="4252" w:type="dxa"/>
           </w:tcPr>
           <w:p>
             <w:r>
@@ -3546,7 +3513,7 @@
         </w:tc>
         <w:tc>
           <w:tcPr>
-            <w:tcW w:type="dxa" w:w="4252"/>
+            <w:tcW w:w="4252" w:type="dxa"/>
           </w:tcPr>
           <w:p>
             <w:r>
@@ -3559,9 +3526,12 @@
         </w:tc>
       </w:tr>
       <w:tr>
-        <w:tc>
-          <w:tcPr>
-            <w:tcW w:type="dxa" w:w="4252"/>
+        <w:trPr>
+          <w:jc w:val="center"/>
+        </w:trPr>
+        <w:tc>
+          <w:tcPr>
+            <w:tcW w:w="4252" w:type="dxa"/>
           </w:tcPr>
           <w:p>
             <w:r>
@@ -3574,7 +3544,7 @@
         </w:tc>
         <w:tc>
           <w:tcPr>
-            <w:tcW w:type="dxa" w:w="4252"/>
+            <w:tcW w:w="4252" w:type="dxa"/>
           </w:tcPr>
           <w:p>
             <w:r>
@@ -3587,9 +3557,12 @@
         </w:tc>
       </w:tr>
       <w:tr>
-        <w:tc>
-          <w:tcPr>
-            <w:tcW w:type="dxa" w:w="4252"/>
+        <w:trPr>
+          <w:jc w:val="center"/>
+        </w:trPr>
+        <w:tc>
+          <w:tcPr>
+            <w:tcW w:w="4252" w:type="dxa"/>
           </w:tcPr>
           <w:p>
             <w:r>
@@ -3602,7 +3575,7 @@
         </w:tc>
         <w:tc>
           <w:tcPr>
-            <w:tcW w:type="dxa" w:w="4252"/>
+            <w:tcW w:w="4252" w:type="dxa"/>
           </w:tcPr>
           <w:p>
             <w:r>
@@ -3615,9 +3588,12 @@
         </w:tc>
       </w:tr>
       <w:tr>
-        <w:tc>
-          <w:tcPr>
-            <w:tcW w:type="dxa" w:w="4252"/>
+        <w:trPr>
+          <w:jc w:val="center"/>
+        </w:trPr>
+        <w:tc>
+          <w:tcPr>
+            <w:tcW w:w="4252" w:type="dxa"/>
           </w:tcPr>
           <w:p>
             <w:r>
@@ -3630,22 +3606,25 @@
         </w:tc>
         <w:tc>
           <w:tcPr>
-            <w:tcW w:type="dxa" w:w="4252"/>
-          </w:tcPr>
-          <w:p>
-            <w:r>
-              <w:rPr>
-                <w:sz w:val="18"/>
-              </w:rPr>
-              <w:t>Exportación PDF por sesión, con branding institucional</w:t>
+            <w:tcW w:w="4252" w:type="dxa"/>
+          </w:tcPr>
+          <w:p>
+            <w:r>
+              <w:rPr>
+                <w:sz w:val="18"/>
+              </w:rPr>
+              <w:t>Exportación PDF por sesión.</w:t>
             </w:r>
           </w:p>
         </w:tc>
       </w:tr>
       <w:tr>
-        <w:tc>
-          <w:tcPr>
-            <w:tcW w:type="dxa" w:w="4252"/>
+        <w:trPr>
+          <w:jc w:val="center"/>
+        </w:trPr>
+        <w:tc>
+          <w:tcPr>
+            <w:tcW w:w="4252" w:type="dxa"/>
           </w:tcPr>
           <w:p>
             <w:r>
@@ -3658,7 +3637,7 @@
         </w:tc>
         <w:tc>
           <w:tcPr>
-            <w:tcW w:type="dxa" w:w="4252"/>
+            <w:tcW w:w="4252" w:type="dxa"/>
           </w:tcPr>
           <w:p>
             <w:r>
@@ -3671,9 +3650,12 @@
         </w:tc>
       </w:tr>
       <w:tr>
-        <w:tc>
-          <w:tcPr>
-            <w:tcW w:type="dxa" w:w="4252"/>
+        <w:trPr>
+          <w:jc w:val="center"/>
+        </w:trPr>
+        <w:tc>
+          <w:tcPr>
+            <w:tcW w:w="4252" w:type="dxa"/>
           </w:tcPr>
           <w:p>
             <w:r>
@@ -3686,7 +3668,7 @@
         </w:tc>
         <w:tc>
           <w:tcPr>
-            <w:tcW w:type="dxa" w:w="4252"/>
+            <w:tcW w:w="4252" w:type="dxa"/>
           </w:tcPr>
           <w:p>
             <w:r>
@@ -3701,11 +3683,8 @@
     </w:tbl>
     <w:p/>
     <w:p>
-      <w:pPr>
-        <w:spacing w:line="360" w:lineRule="auto"/>
-      </w:pPr>
-      <w:r>
-        <w:t>Respecto a los objetivos: la visualización de la onda es en tiempo real (OD1) y la integridad de datos sesión-perfil se cumple al 100% (OD3). La meta de WER &lt; 10% (OD2) queda sujeta a una medición con datos de uso real, dado que la recolección se realiza a través del uso de la aplicación por los estudiantes.</w:t>
+      <w:r>
+        <w:t>Respecto a los objetivos: la visualización de la onda es en tiempo real (OD1) y la integridad de datos sesión-perfil se cumple al 100% (OD3). La meta de WER &lt; 10% (OD2) queda sujeta a verificación durante la operación del sistema en condiciones reales de uso.</w:t>
       </w:r>
     </w:p>
     <w:p>
@@ -3717,41 +3696,26 @@
       </w:r>
     </w:p>
     <w:p>
-      <w:pPr>
-        <w:spacing w:line="360" w:lineRule="auto"/>
-      </w:pPr>
-      <w:r>
-        <w:t>•  Es factible construir un sistema de retroalimentación por voz, ético y desplegable a bajo costo, que evalúe objetivamente la fluidez oral de niños de primer grado en español.</w:t>
-      </w:r>
-    </w:p>
-    <w:p>
-      <w:pPr>
-        <w:spacing w:line="360" w:lineRule="auto"/>
-      </w:pPr>
+      <w:r>
+        <w:t>•  Es factible construir un sistema de retroalimentación por voz, ético y desplegable a bajo costo, que evalúe objetivamente la fluidez oral en educación primaria en español.</w:t>
+      </w:r>
+    </w:p>
+    <w:p>
       <w:r>
         <w:t>•  La integración de tecnologías del estado del arte (Whisper, BETO y Praat) permitió cubrir las tres dimensiones de evaluación sin necesidad de entrenar modelos propios.</w:t>
       </w:r>
     </w:p>
     <w:p>
-      <w:pPr>
-        <w:spacing w:line="360" w:lineRule="auto"/>
-      </w:pPr>
       <w:r>
         <w:t>•  El procesamiento local y la eliminación del audio constituyen una ventaja ética frente a las soluciones que dependen de servicios de reconocimiento en la nube.</w:t>
       </w:r>
     </w:p>
     <w:p>
-      <w:pPr>
-        <w:spacing w:line="360" w:lineRule="auto"/>
-      </w:pPr>
       <w:r>
         <w:t>•  El uso de un esquema de puntuación basado en reglas resulta adecuado ante la ausencia de un conjunto de datos etiquetado de voz infantil.</w:t>
       </w:r>
     </w:p>
     <w:p>
-      <w:pPr>
-        <w:spacing w:line="360" w:lineRule="auto"/>
-      </w:pPr>
       <w:r>
         <w:t>•  El sistema cumple de forma sustancial el alcance comprometido en el Project Charter y el Product Backlog.</w:t>
       </w:r>
@@ -3761,45 +3725,31 @@
         <w:pStyle w:val="Ttulo1"/>
       </w:pPr>
       <w:r>
+        <w:lastRenderedPageBreak/>
         <w:t>9. Recomendaciones</w:t>
       </w:r>
     </w:p>
     <w:p>
-      <w:pPr>
-        <w:spacing w:line="360" w:lineRule="auto"/>
-      </w:pPr>
-      <w:r>
-        <w:t>•  Realizar la medición del WER con datos de uso real y complementarla con un baseline de reconocimiento puro leído por los investigadores.</w:t>
-      </w:r>
-    </w:p>
-    <w:p>
-      <w:pPr>
-        <w:spacing w:line="360" w:lineRule="auto"/>
-      </w:pPr>
-      <w:r>
-        <w:t>•  Emplear micrófonos cardioides con cancelación de ruido para reducir el WER en el aula rural.</w:t>
-      </w:r>
-    </w:p>
-    <w:p>
-      <w:pPr>
-        <w:spacing w:line="360" w:lineRule="auto"/>
-      </w:pPr>
+      <w:r>
+        <w:t>Realizar la medición del WER con datos de uso real y complementarla con un baseline de reconocimiento puro en condiciones controladas.</w:t>
+      </w:r>
+    </w:p>
+    <w:p>
+      <w:r>
+        <w:t>•  Emplear micrófonos cardioides con cancelación de ruido para reducir el WER en entornos acústicamente adversos.</w:t>
+      </w:r>
+    </w:p>
+    <w:p>
       <w:r>
         <w:t>•  Considerar, como trabajo futuro, un modelo de aprendizaje automático para la clasificación de la fluidez una vez se disponga de datos etiquetados.</w:t>
       </w:r>
     </w:p>
     <w:p>
-      <w:pPr>
-        <w:spacing w:line="360" w:lineRule="auto"/>
-      </w:pPr>
       <w:r>
         <w:t>•  Incorporar un banco de textos administrable por el docente y, opcionalmente, voces de síntesis neuronal para una retroalimentación auditiva más natural.</w:t>
       </w:r>
     </w:p>
     <w:p>
-      <w:pPr>
-        <w:spacing w:line="360" w:lineRule="auto"/>
-      </w:pPr>
       <w:r>
         <w:t>•  Capacitar brevemente a los docentes en el uso del panel y la interpretación de las métricas.</w:t>
       </w:r>
@@ -3813,50 +3763,33 @@
       </w:r>
     </w:p>
     <w:p>
-      <w:pPr>
-        <w:spacing w:line="360" w:lineRule="auto"/>
-      </w:pPr>
       <w:r>
         <w:t>Cevallos Correa, F. L., &amp; Gómez Ríos, M. D. (2021). Reconocimiento automático de voz aplicado a la mejora en el proceso de aprendizaje de lectura en nivel escolar (Trabajo de grado). Universidad Politécnica Salesiana, Guayaquil, Ecuador.</w:t>
       </w:r>
     </w:p>
     <w:p>
-      <w:pPr>
-        <w:spacing w:line="360" w:lineRule="auto"/>
-      </w:pPr>
       <w:r>
         <w:t>García Pazos, E. A., Escalante Vega, J. E., Alonso Ramírez, O., &amp; Castañeda Sánchez, F. (2025). Software de reconocimiento de voz para el desarrollo de la pronunciación de inglés: Una revisión sistemática. RITI Journal, 13(29). https://doi.org/10.36825/RITI.13.29.014</w:t>
       </w:r>
     </w:p>
     <w:p>
-      <w:pPr>
-        <w:spacing w:line="360" w:lineRule="auto"/>
-      </w:pPr>
       <w:r>
         <w:t>Haider, F., Koutsombogera, M., Conlan, O., Vogel, C., Campbell, N., &amp; Luz, S. (2020). An Active Data Representation of Videos for Automatic Scoring of Oral Presentation Delivery Skills and Feedback Generation. Frontiers in Computer Science, 2, 1. https://doi.org/10.3389/fcomp.2020.00001</w:t>
       </w:r>
     </w:p>
     <w:p>
-      <w:pPr>
-        <w:spacing w:line="360" w:lineRule="auto"/>
-      </w:pPr>
       <w:r>
         <w:t>Jinga, N., Anghel, A. M., Moldoveanu, F., Moldoveanu, A., Morar, A., &amp; Petrescu, L. (2024). Overcoming Fear and Improving Public Speaking Skills through Adaptive VR Training. Electronics, 13(11), 2042. https://doi.org/10.3390/electronics13112042</w:t>
       </w:r>
     </w:p>
     <w:p>
-      <w:pPr>
-        <w:spacing w:line="360" w:lineRule="auto"/>
-      </w:pPr>
       <w:r>
         <w:t>Sánchez, L., Morales, A., &amp; Rodríguez, I. (2024). Speech Recognition Software as a Tool to Enhance EFL Learners' Pronunciation. Lengua y Sociedad, 23(2), 963-983. https://doi.org/10.15381/lengsoc.v23i2.26074</w:t>
       </w:r>
     </w:p>
     <w:p>
-      <w:pPr>
-        <w:spacing w:line="360" w:lineRule="auto"/>
-      </w:pPr>
-      <w:r>
+      <w:r>
+        <w:lastRenderedPageBreak/>
         <w:t>Sonnleitner, B., Madou, T., Deceuninck, M., Theodosiou, F., &amp; Sagaert, Y. R. (2025). Evaluation of early student performance prediction given concept drift. Computers and Education: Artificial Intelligence, 8, 100369. Elsevier.</w:t>
       </w:r>
     </w:p>
@@ -3869,49 +3802,31 @@
       </w:r>
     </w:p>
     <w:p>
-      <w:pPr>
-        <w:spacing w:line="360" w:lineRule="auto"/>
-      </w:pPr>
       <w:r>
         <w:t>•  Anexo A - Código fuente: repositorio GitHub https://github.com/ramdhum-a-s-e/SRV-Oratoria-IA (y repositorio del equipo https://github.com/ALS-12321/SRV-Oratoria-IA).</w:t>
       </w:r>
     </w:p>
     <w:p>
-      <w:pPr>
-        <w:spacing w:line="360" w:lineRule="auto"/>
-      </w:pPr>
       <w:r>
         <w:t>•  Anexo B - Manual de Usuario (documento MANUAL_USUARIO.docx).</w:t>
       </w:r>
     </w:p>
     <w:p>
-      <w:pPr>
-        <w:spacing w:line="360" w:lineRule="auto"/>
-      </w:pPr>
       <w:r>
         <w:t>•  Anexo C - Documentación de Arquitectura (documento ARQUITECTURA.docx).</w:t>
       </w:r>
     </w:p>
     <w:p>
-      <w:pPr>
-        <w:spacing w:line="360" w:lineRule="auto"/>
-      </w:pPr>
       <w:r>
         <w:t>•  Anexo D - Justificaciones de decisiones técnicas del Charter (JUSTIFICACIONES_CHARTER.docx).</w:t>
       </w:r>
     </w:p>
     <w:p>
-      <w:pPr>
-        <w:spacing w:line="360" w:lineRule="auto"/>
-      </w:pPr>
       <w:r>
         <w:t>•  Anexo E - Cuadro comparativo de antecedentes (COMPARATIVA_ANTECEDENTES.docx).</w:t>
       </w:r>
     </w:p>
     <w:p>
-      <w:pPr>
-        <w:spacing w:line="360" w:lineRule="auto"/>
-      </w:pPr>
       <w:r>
         <w:t>•  Anexo F - Diagramas UML y modelo de datos (ver Documentación de Arquitectura).</w:t>
       </w:r>
@@ -3927,7 +3842,7 @@
 </file>
 
 <file path=word/numbering.xml><?xml version="1.0" encoding="utf-8"?>
-<w:numbering xmlns:wpc="http://schemas.microsoft.com/office/word/2010/wordprocessingCanvas" xmlns:cx="http://schemas.microsoft.com/office/drawing/2014/chartex" xmlns:cx1="http://schemas.microsoft.com/office/drawing/2015/9/8/chartex" xmlns:cx2="http://schemas.microsoft.com/office/drawing/2015/10/21/chartex" xmlns:cx3="http://schemas.microsoft.com/office/drawing/2016/5/9/chartex" xmlns:cx4="http://schemas.microsoft.com/office/drawing/2016/5/10/chartex" xmlns:cx5="http://schemas.microsoft.com/office/drawing/2016/5/11/chartex" xmlns:cx6="http://schemas.microsoft.com/office/drawing/2016/5/12/chartex" xmlns:cx7="http://schemas.microsoft.com/office/drawing/2016/5/13/chartex" xmlns:cx8="http://schemas.microsoft.com/office/drawing/2016/5/14/chartex" xmlns:mc="http://schemas.openxmlformats.org/markup-compatibility/2006" xmlns:aink="http://schemas.microsoft.com/office/drawing/2016/ink" xmlns:am3d="http://schemas.microsoft.com/office/drawing/2017/model3d" xmlns:o="urn:schemas-microsoft-com:office:office" xmlns:r="http://schemas.openxmlformats.org/officeDocument/2006/relationships" xmlns:m="http://schemas.openxmlformats.org/officeDocument/2006/math" xmlns:v="urn:schemas-microsoft-com:vml" xmlns:wp14="http://schemas.microsoft.com/office/word/2010/wordprocessingDrawing" xmlns:wp="http://schemas.openxmlformats.org/drawingml/2006/wordprocessingDrawing" xmlns:w10="urn:schemas-microsoft-com:office:word" xmlns:w="http://schemas.openxmlformats.org/wordprocessingml/2006/main" xmlns:w14="http://schemas.microsoft.com/office/word/2010/wordml" xmlns:w15="http://schemas.microsoft.com/office/word/2012/wordml" xmlns:w16cex="http://schemas.microsoft.com/office/word/2018/wordml/cex" xmlns:w16cid="http://schemas.microsoft.com/office/word/2016/wordml/cid" xmlns:w16="http://schemas.microsoft.com/office/word/2018/wordml" xmlns:w16sdtdh="http://schemas.microsoft.com/office/word/2020/wordml/sdtdatahash" xmlns:w16se="http://schemas.microsoft.com/office/word/2015/wordml/symex" xmlns:wpg="http://schemas.microsoft.com/office/word/2010/wordprocessingGroup" xmlns:wpi="http://schemas.microsoft.com/office/word/2010/wordprocessingInk" xmlns:wne="http://schemas.microsoft.com/office/word/2006/wordml" xmlns:wps="http://schemas.microsoft.com/office/word/2010/wordprocessingShape" mc:Ignorable="w14 w15 w16se w16cid w16 w16cex w16sdtdh wp14">
+<w:numbering xmlns:wpc="http://schemas.microsoft.com/office/word/2010/wordprocessingCanvas" xmlns:cx="http://schemas.microsoft.com/office/drawing/2014/chartex" xmlns:cx1="http://schemas.microsoft.com/office/drawing/2015/9/8/chartex" xmlns:cx2="http://schemas.microsoft.com/office/drawing/2015/10/21/chartex" xmlns:cx3="http://schemas.microsoft.com/office/drawing/2016/5/9/chartex" xmlns:cx4="http://schemas.microsoft.com/office/drawing/2016/5/10/chartex" xmlns:cx5="http://schemas.microsoft.com/office/drawing/2016/5/11/chartex" xmlns:cx6="http://schemas.microsoft.com/office/drawing/2016/5/12/chartex" xmlns:cx7="http://schemas.microsoft.com/office/drawing/2016/5/13/chartex" xmlns:cx8="http://schemas.microsoft.com/office/drawing/2016/5/14/chartex" xmlns:mc="http://schemas.openxmlformats.org/markup-compatibility/2006" xmlns:aink="http://schemas.microsoft.com/office/drawing/2016/ink" xmlns:am3d="http://schemas.microsoft.com/office/drawing/2017/model3d" xmlns:o="urn:schemas-microsoft-com:office:office" xmlns:oel="http://schemas.microsoft.com/office/2019/extlst" xmlns:r="http://schemas.openxmlformats.org/officeDocument/2006/relationships" xmlns:m="http://schemas.openxmlformats.org/officeDocument/2006/math" xmlns:v="urn:schemas-microsoft-com:vml" xmlns:wp14="http://schemas.microsoft.com/office/word/2010/wordprocessingDrawing" xmlns:wp="http://schemas.openxmlformats.org/drawingml/2006/wordprocessingDrawing" xmlns:w10="urn:schemas-microsoft-com:office:word" xmlns:w="http://schemas.openxmlformats.org/wordprocessingml/2006/main" xmlns:w14="http://schemas.microsoft.com/office/word/2010/wordml" xmlns:w15="http://schemas.microsoft.com/office/word/2012/wordml" xmlns:w16cex="http://schemas.microsoft.com/office/word/2018/wordml/cex" xmlns:w16cid="http://schemas.microsoft.com/office/word/2016/wordml/cid" xmlns:w16="http://schemas.microsoft.com/office/word/2018/wordml" xmlns:w16du="http://schemas.microsoft.com/office/word/2023/wordml/word16du" xmlns:w16sdtdh="http://schemas.microsoft.com/office/word/2020/wordml/sdtdatahash" xmlns:w16sdtfl="http://schemas.microsoft.com/office/word/2024/wordml/sdtformatlock" xmlns:w16se="http://schemas.microsoft.com/office/word/2015/wordml/symex" xmlns:wpg="http://schemas.microsoft.com/office/word/2010/wordprocessingGroup" xmlns:wpi="http://schemas.microsoft.com/office/word/2010/wordprocessingInk" xmlns:wne="http://schemas.microsoft.com/office/word/2006/wordml" xmlns:wps="http://schemas.microsoft.com/office/word/2010/wordprocessingShape" mc:Ignorable="w14 w15 w16se w16cid w16 w16cex w16sdtdh w16sdtfl w16du wp14">
   <w:abstractNum w:abstractNumId="0" w15:restartNumberingAfterBreak="0">
     <w:nsid w:val="18E542E3"/>
     <w:multiLevelType w:val="multilevel"/>
@@ -4481,26 +4396,26 @@
       </w:rPr>
     </w:lvl>
   </w:abstractNum>
-  <w:num w:numId="1">
+  <w:num w:numId="1" w16cid:durableId="1871913103">
     <w:abstractNumId w:val="3"/>
   </w:num>
-  <w:num w:numId="2">
+  <w:num w:numId="2" w16cid:durableId="1299609249">
     <w:abstractNumId w:val="1"/>
   </w:num>
-  <w:num w:numId="3">
+  <w:num w:numId="3" w16cid:durableId="91704181">
     <w:abstractNumId w:val="0"/>
   </w:num>
-  <w:num w:numId="4">
+  <w:num w:numId="4" w16cid:durableId="1555778176">
     <w:abstractNumId w:val="4"/>
   </w:num>
-  <w:num w:numId="5">
+  <w:num w:numId="5" w16cid:durableId="1629242976">
     <w:abstractNumId w:val="2"/>
   </w:num>
 </w:numbering>
 </file>
 
 <file path=word/styles.xml><?xml version="1.0" encoding="utf-8"?>
-<w:styles xmlns:mc="http://schemas.openxmlformats.org/markup-compatibility/2006" xmlns:r="http://schemas.openxmlformats.org/officeDocument/2006/relationships" xmlns:w="http://schemas.openxmlformats.org/wordprocessingml/2006/main" xmlns:w14="http://schemas.microsoft.com/office/word/2010/wordml" xmlns:w15="http://schemas.microsoft.com/office/word/2012/wordml" xmlns:w16cex="http://schemas.microsoft.com/office/word/2018/wordml/cex" xmlns:w16cid="http://schemas.microsoft.com/office/word/2016/wordml/cid" xmlns:w16="http://schemas.microsoft.com/office/word/2018/wordml" xmlns:w16sdtdh="http://schemas.microsoft.com/office/word/2020/wordml/sdtdatahash" xmlns:w16se="http://schemas.microsoft.com/office/word/2015/wordml/symex" mc:Ignorable="w14 w15 w16se w16cid w16 w16cex w16sdtdh">
+<w:styles xmlns:mc="http://schemas.openxmlformats.org/markup-compatibility/2006" xmlns:r="http://schemas.openxmlformats.org/officeDocument/2006/relationships" xmlns:w="http://schemas.openxmlformats.org/wordprocessingml/2006/main" xmlns:w14="http://schemas.microsoft.com/office/word/2010/wordml" xmlns:w15="http://schemas.microsoft.com/office/word/2012/wordml" xmlns:w16cex="http://schemas.microsoft.com/office/word/2018/wordml/cex" xmlns:w16cid="http://schemas.microsoft.com/office/word/2016/wordml/cid" xmlns:w16="http://schemas.microsoft.com/office/word/2018/wordml" xmlns:w16du="http://schemas.microsoft.com/office/word/2023/wordml/word16du" xmlns:w16sdtdh="http://schemas.microsoft.com/office/word/2020/wordml/sdtdatahash" xmlns:w16sdtfl="http://schemas.microsoft.com/office/word/2024/wordml/sdtformatlock" xmlns:w16se="http://schemas.microsoft.com/office/word/2015/wordml/symex" mc:Ignorable="w14 w15 w16se w16cid w16 w16cex w16sdtdh w16sdtfl w16du">
   <w:docDefaults>
     <w:rPrDefault>
       <w:rPr>
@@ -4903,7 +4818,6 @@
     </w:pPr>
     <w:rPr>
       <w:rFonts w:ascii="Arial" w:hAnsi="Arial"/>
-      <w:sz w:val="22"/>
     </w:rPr>
   </w:style>
   <w:style w:type="paragraph" w:styleId="Ttulo1">
@@ -5106,7 +5020,7 @@
       <w:lang w:eastAsia="es-PE"/>
     </w:rPr>
   </w:style>
-  <w:style w:type="character" w:styleId="Textoennegrita">
+  <w:style w:type="character" w:styleId="Fuerte">
     <w:name w:val="Strong"/>
     <w:basedOn w:val="Fuentedeprrafopredeter"/>
     <w:uiPriority w:val="22"/>
@@ -5615,8 +5529,8 @@
 <file path=customXml/itemProps1.xml><?xml version="1.0" encoding="utf-8"?>
 <ds:datastoreItem xmlns:ds="http://schemas.openxmlformats.org/officeDocument/2006/customXml" ds:itemID="{11111111-1234-1234-1234-123412341234}">
   <ds:schemaRefs>
+    <ds:schemaRef ds:uri="http://customooxmlschemas.google.com/"/>
     <ds:schemaRef ds:uri="http://schemas.openxmlformats.org/officeDocument/2006/relationships"/>
-    <ds:schemaRef ds:uri="http://customooxmlschemas.google.com/"/>
   </ds:schemaRefs>
 </ds:datastoreItem>
 </file>
</xml_diff>